<commit_message>
Update WBS; Remove unneeded Tank Info versions
</commit_message>
<xml_diff>
--- a/Documentation/Analysis/WBS/Project WBS - W.docx
+++ b/Documentation/Analysis/WBS/Project WBS - W.docx
@@ -48,23 +48,24 @@
         <w:tblLayout w:type="fixed"/>
       </w:tblPr>
       <w:tblGrid>
-        <w:gridCol w:w="951"/>
-        <w:gridCol w:w="4525"/>
-        <w:gridCol w:w="1152"/>
-        <w:gridCol w:w="1402"/>
-        <w:gridCol w:w="1253"/>
+        <w:gridCol w:w="838"/>
+        <w:gridCol w:w="3987"/>
+        <w:gridCol w:w="1104"/>
+        <w:gridCol w:w="1015"/>
+        <w:gridCol w:w="1235"/>
+        <w:gridCol w:w="1104"/>
       </w:tblGrid>
       <w:tr>
         <w:tblPrEx>
           <w:shd w:val="clear" w:color="auto" w:fill="00a2ff"/>
         </w:tblPrEx>
         <w:trPr>
-          <w:trHeight w:val="489" w:hRule="atLeast"/>
+          <w:trHeight w:val="969" w:hRule="atLeast"/>
           <w:tblHeader/>
         </w:trPr>
         <w:tc>
           <w:tcPr>
-            <w:tcW w:type="dxa" w:w="951"/>
+            <w:tcW w:type="dxa" w:w="838"/>
             <w:tcBorders>
               <w:top w:val="single" w:color="929292" w:sz="4" w:space="0" w:shadow="0" w:frame="0"/>
               <w:left w:val="single" w:color="929292" w:sz="4" w:space="0" w:shadow="0" w:frame="0"/>
@@ -96,7 +97,7 @@
         </w:tc>
         <w:tc>
           <w:tcPr>
-            <w:tcW w:type="dxa" w:w="4525"/>
+            <w:tcW w:type="dxa" w:w="3986"/>
             <w:tcBorders>
               <w:top w:val="single" w:color="929292" w:sz="4" w:space="0" w:shadow="0" w:frame="0"/>
               <w:left w:val="single" w:color="ffffff" w:sz="4" w:space="0" w:shadow="0" w:frame="0"/>
@@ -128,7 +129,7 @@
         </w:tc>
         <w:tc>
           <w:tcPr>
-            <w:tcW w:type="dxa" w:w="1151"/>
+            <w:tcW w:type="dxa" w:w="1104"/>
             <w:tcBorders>
               <w:top w:val="single" w:color="929292" w:sz="4" w:space="0" w:shadow="0" w:frame="0"/>
               <w:left w:val="single" w:color="ffffff" w:sz="4" w:space="0" w:shadow="0" w:frame="0"/>
@@ -154,26 +155,27 @@
                 <w:rFonts w:ascii="Helvetica Neue" w:cs="Arial Unicode MS" w:hAnsi="Helvetica Neue" w:eastAsia="Arial Unicode MS"/>
                 <w:rtl w:val="0"/>
               </w:rPr>
-              <w:t>Duration</w:t>
-            </w:r>
-          </w:p>
-          <w:p>
-            <w:pPr>
-              <w:pStyle w:val="Table Style 3"/>
-              <w:bidi w:val="0"/>
-            </w:pPr>
+              <w:t>Address in Teacher</w:t>
+            </w:r>
+            <w:r>
+              <w:rPr>
+                <w:rFonts w:ascii="Helvetica Neue" w:cs="Arial Unicode MS" w:hAnsi="Helvetica Neue" w:eastAsia="Arial Unicode MS" w:hint="default"/>
+                <w:rtl w:val="0"/>
+              </w:rPr>
+              <w:t>’</w:t>
+            </w:r>
             <w:r>
               <w:rPr>
                 <w:rFonts w:ascii="Helvetica Neue" w:cs="Arial Unicode MS" w:hAnsi="Helvetica Neue" w:eastAsia="Arial Unicode MS"/>
                 <w:rtl w:val="0"/>
               </w:rPr>
-              <w:t>(in weeks)</w:t>
-            </w:r>
-          </w:p>
-        </w:tc>
-        <w:tc>
-          <w:tcPr>
-            <w:tcW w:type="dxa" w:w="1402"/>
+              <w:t>s notes</w:t>
+            </w:r>
+          </w:p>
+        </w:tc>
+        <w:tc>
+          <w:tcPr>
+            <w:tcW w:type="dxa" w:w="1014"/>
             <w:tcBorders>
               <w:top w:val="single" w:color="929292" w:sz="4" w:space="0" w:shadow="0" w:frame="0"/>
               <w:left w:val="single" w:color="ffffff" w:sz="4" w:space="0" w:shadow="0" w:frame="0"/>
@@ -199,13 +201,58 @@
                 <w:rFonts w:ascii="Helvetica Neue" w:cs="Arial Unicode MS" w:hAnsi="Helvetica Neue" w:eastAsia="Arial Unicode MS"/>
                 <w:rtl w:val="0"/>
               </w:rPr>
+              <w:t>Duration</w:t>
+            </w:r>
+          </w:p>
+          <w:p>
+            <w:pPr>
+              <w:pStyle w:val="Table Style 3"/>
+              <w:bidi w:val="0"/>
+            </w:pPr>
+            <w:r>
+              <w:rPr>
+                <w:rFonts w:ascii="Helvetica Neue" w:cs="Arial Unicode MS" w:hAnsi="Helvetica Neue" w:eastAsia="Arial Unicode MS"/>
+                <w:rtl w:val="0"/>
+              </w:rPr>
+              <w:t>(in weeks)</w:t>
+            </w:r>
+          </w:p>
+        </w:tc>
+        <w:tc>
+          <w:tcPr>
+            <w:tcW w:type="dxa" w:w="1235"/>
+            <w:tcBorders>
+              <w:top w:val="single" w:color="929292" w:sz="4" w:space="0" w:shadow="0" w:frame="0"/>
+              <w:left w:val="single" w:color="ffffff" w:sz="4" w:space="0" w:shadow="0" w:frame="0"/>
+              <w:bottom w:val="single" w:color="89847f" w:sz="8" w:space="0" w:shadow="0" w:frame="0"/>
+              <w:right w:val="single" w:color="ffffff" w:sz="4" w:space="0" w:shadow="0" w:frame="0"/>
+            </w:tcBorders>
+            <w:shd w:val="clear" w:color="auto" w:fill="00a2ff"/>
+            <w:tcMar>
+              <w:top w:type="dxa" w:w="80"/>
+              <w:left w:type="dxa" w:w="80"/>
+              <w:bottom w:type="dxa" w:w="80"/>
+              <w:right w:type="dxa" w:w="80"/>
+            </w:tcMar>
+            <w:vAlign w:val="top"/>
+          </w:tcPr>
+          <w:p>
+            <w:pPr>
+              <w:pStyle w:val="Table Style 3"/>
+              <w:bidi w:val="0"/>
+            </w:pPr>
+            <w:r>
+              <w:rPr>
+                <w:rFonts w:ascii="Helvetica Neue" w:cs="Arial Unicode MS" w:hAnsi="Helvetica Neue" w:eastAsia="Arial Unicode MS"/>
+                <w:rtl w:val="0"/>
+              </w:rPr>
               <w:t>Dependency</w:t>
             </w:r>
           </w:p>
         </w:tc>
         <w:tc>
           <w:tcPr>
-            <w:tcW w:type="dxa" w:w="1253"/>
+            <w:tcW w:type="dxa" w:w="1104"/>
             <w:tcBorders>
               <w:top w:val="single" w:color="929292" w:sz="4" w:space="0" w:shadow="0" w:frame="0"/>
               <w:left w:val="single" w:color="ffffff" w:sz="4" w:space="0" w:shadow="0" w:frame="0"/>
@@ -245,7 +292,7 @@
         </w:trPr>
         <w:tc>
           <w:tcPr>
-            <w:tcW w:type="dxa" w:w="951"/>
+            <w:tcW w:type="dxa" w:w="838"/>
             <w:tcBorders>
               <w:top w:val="single" w:color="89847f" w:sz="8" w:space="0" w:shadow="0" w:frame="0"/>
               <w:left w:val="single" w:color="929292" w:sz="4" w:space="0" w:shadow="0" w:frame="0"/>
@@ -277,7 +324,7 @@
         </w:tc>
         <w:tc>
           <w:tcPr>
-            <w:tcW w:type="dxa" w:w="4525"/>
+            <w:tcW w:type="dxa" w:w="3986"/>
             <w:tcBorders>
               <w:top w:val="single" w:color="89847f" w:sz="8" w:space="0" w:shadow="0" w:frame="0"/>
               <w:left w:val="single" w:color="89847f" w:sz="8" w:space="0" w:shadow="0" w:frame="0"/>
@@ -309,7 +356,7 @@
         </w:tc>
         <w:tc>
           <w:tcPr>
-            <w:tcW w:type="dxa" w:w="1151"/>
+            <w:tcW w:type="dxa" w:w="1104"/>
             <w:tcBorders>
               <w:top w:val="single" w:color="89847f" w:sz="8" w:space="0" w:shadow="0" w:frame="0"/>
               <w:left w:val="single" w:color="929292" w:sz="4" w:space="0" w:shadow="0" w:frame="0"/>
@@ -325,6 +372,26 @@
             </w:tcMar>
             <w:vAlign w:val="top"/>
           </w:tcPr>
+          <w:p/>
+        </w:tc>
+        <w:tc>
+          <w:tcPr>
+            <w:tcW w:type="dxa" w:w="1014"/>
+            <w:tcBorders>
+              <w:top w:val="single" w:color="89847f" w:sz="8" w:space="0" w:shadow="0" w:frame="0"/>
+              <w:left w:val="single" w:color="929292" w:sz="4" w:space="0" w:shadow="0" w:frame="0"/>
+              <w:bottom w:val="single" w:color="929292" w:sz="4" w:space="0" w:shadow="0" w:frame="0"/>
+              <w:right w:val="single" w:color="929292" w:sz="4" w:space="0" w:shadow="0" w:frame="0"/>
+            </w:tcBorders>
+            <w:shd w:val="clear" w:color="auto" w:fill="auto"/>
+            <w:tcMar>
+              <w:top w:type="dxa" w:w="80"/>
+              <w:left w:type="dxa" w:w="80"/>
+              <w:bottom w:type="dxa" w:w="80"/>
+              <w:right w:type="dxa" w:w="80"/>
+            </w:tcMar>
+            <w:vAlign w:val="top"/>
+          </w:tcPr>
           <w:p>
             <w:pPr>
               <w:pStyle w:val="Table Style 2"/>
@@ -341,7 +408,7 @@
         </w:tc>
         <w:tc>
           <w:tcPr>
-            <w:tcW w:type="dxa" w:w="1402"/>
+            <w:tcW w:type="dxa" w:w="1235"/>
             <w:tcBorders>
               <w:top w:val="single" w:color="89847f" w:sz="8" w:space="0" w:shadow="0" w:frame="0"/>
               <w:left w:val="single" w:color="929292" w:sz="4" w:space="0" w:shadow="0" w:frame="0"/>
@@ -361,7 +428,7 @@
         </w:tc>
         <w:tc>
           <w:tcPr>
-            <w:tcW w:type="dxa" w:w="1253"/>
+            <w:tcW w:type="dxa" w:w="1104"/>
             <w:tcBorders>
               <w:top w:val="single" w:color="89847f" w:sz="8" w:space="0" w:shadow="0" w:frame="0"/>
               <w:left w:val="single" w:color="929292" w:sz="4" w:space="0" w:shadow="0" w:frame="0"/>
@@ -439,7 +506,7 @@
         </w:trPr>
         <w:tc>
           <w:tcPr>
-            <w:tcW w:type="dxa" w:w="951"/>
+            <w:tcW w:type="dxa" w:w="838"/>
             <w:tcBorders>
               <w:top w:val="single" w:color="929292" w:sz="4" w:space="0" w:shadow="0" w:frame="0"/>
               <w:left w:val="single" w:color="929292" w:sz="4" w:space="0" w:shadow="0" w:frame="0"/>
@@ -471,7 +538,7 @@
         </w:tc>
         <w:tc>
           <w:tcPr>
-            <w:tcW w:type="dxa" w:w="4525"/>
+            <w:tcW w:type="dxa" w:w="3986"/>
             <w:tcBorders>
               <w:top w:val="single" w:color="929292" w:sz="4" w:space="0" w:shadow="0" w:frame="0"/>
               <w:left w:val="single" w:color="89847f" w:sz="8" w:space="0" w:shadow="0" w:frame="0"/>
@@ -503,7 +570,7 @@
         </w:tc>
         <w:tc>
           <w:tcPr>
-            <w:tcW w:type="dxa" w:w="1151"/>
+            <w:tcW w:type="dxa" w:w="1104"/>
             <w:tcBorders>
               <w:top w:val="single" w:color="929292" w:sz="4" w:space="0" w:shadow="0" w:frame="0"/>
               <w:left w:val="single" w:color="929292" w:sz="4" w:space="0" w:shadow="0" w:frame="0"/>
@@ -519,6 +586,26 @@
             </w:tcMar>
             <w:vAlign w:val="top"/>
           </w:tcPr>
+          <w:p/>
+        </w:tc>
+        <w:tc>
+          <w:tcPr>
+            <w:tcW w:type="dxa" w:w="1014"/>
+            <w:tcBorders>
+              <w:top w:val="single" w:color="929292" w:sz="4" w:space="0" w:shadow="0" w:frame="0"/>
+              <w:left w:val="single" w:color="929292" w:sz="4" w:space="0" w:shadow="0" w:frame="0"/>
+              <w:bottom w:val="single" w:color="929292" w:sz="4" w:space="0" w:shadow="0" w:frame="0"/>
+              <w:right w:val="single" w:color="929292" w:sz="4" w:space="0" w:shadow="0" w:frame="0"/>
+            </w:tcBorders>
+            <w:shd w:val="clear" w:color="auto" w:fill="f7f7f6"/>
+            <w:tcMar>
+              <w:top w:type="dxa" w:w="80"/>
+              <w:left w:type="dxa" w:w="80"/>
+              <w:bottom w:type="dxa" w:w="80"/>
+              <w:right w:type="dxa" w:w="80"/>
+            </w:tcMar>
+            <w:vAlign w:val="top"/>
+          </w:tcPr>
           <w:p>
             <w:pPr>
               <w:pStyle w:val="Table Style 2"/>
@@ -535,7 +622,7 @@
         </w:tc>
         <w:tc>
           <w:tcPr>
-            <w:tcW w:type="dxa" w:w="1402"/>
+            <w:tcW w:type="dxa" w:w="1235"/>
             <w:tcBorders>
               <w:top w:val="single" w:color="929292" w:sz="4" w:space="0" w:shadow="0" w:frame="0"/>
               <w:left w:val="single" w:color="929292" w:sz="4" w:space="0" w:shadow="0" w:frame="0"/>
@@ -567,7 +654,7 @@
         </w:tc>
         <w:tc>
           <w:tcPr>
-            <w:tcW w:type="dxa" w:w="1253"/>
+            <w:tcW w:type="dxa" w:w="1104"/>
             <w:tcBorders>
               <w:top w:val="single" w:color="929292" w:sz="4" w:space="0" w:shadow="0" w:frame="0"/>
               <w:left w:val="single" w:color="929292" w:sz="4" w:space="0" w:shadow="0" w:frame="0"/>
@@ -645,7 +732,7 @@
         </w:trPr>
         <w:tc>
           <w:tcPr>
-            <w:tcW w:type="dxa" w:w="951"/>
+            <w:tcW w:type="dxa" w:w="838"/>
             <w:tcBorders>
               <w:top w:val="single" w:color="929292" w:sz="4" w:space="0" w:shadow="0" w:frame="0"/>
               <w:left w:val="single" w:color="929292" w:sz="4" w:space="0" w:shadow="0" w:frame="0"/>
@@ -677,7 +764,7 @@
         </w:tc>
         <w:tc>
           <w:tcPr>
-            <w:tcW w:type="dxa" w:w="4525"/>
+            <w:tcW w:type="dxa" w:w="3986"/>
             <w:tcBorders>
               <w:top w:val="single" w:color="929292" w:sz="4" w:space="0" w:shadow="0" w:frame="0"/>
               <w:left w:val="single" w:color="89847f" w:sz="8" w:space="0" w:shadow="0" w:frame="0"/>
@@ -709,7 +796,7 @@
         </w:tc>
         <w:tc>
           <w:tcPr>
-            <w:tcW w:type="dxa" w:w="1151"/>
+            <w:tcW w:type="dxa" w:w="1104"/>
             <w:tcBorders>
               <w:top w:val="single" w:color="929292" w:sz="4" w:space="0" w:shadow="0" w:frame="0"/>
               <w:left w:val="single" w:color="929292" w:sz="4" w:space="0" w:shadow="0" w:frame="0"/>
@@ -725,6 +812,26 @@
             </w:tcMar>
             <w:vAlign w:val="top"/>
           </w:tcPr>
+          <w:p/>
+        </w:tc>
+        <w:tc>
+          <w:tcPr>
+            <w:tcW w:type="dxa" w:w="1014"/>
+            <w:tcBorders>
+              <w:top w:val="single" w:color="929292" w:sz="4" w:space="0" w:shadow="0" w:frame="0"/>
+              <w:left w:val="single" w:color="929292" w:sz="4" w:space="0" w:shadow="0" w:frame="0"/>
+              <w:bottom w:val="single" w:color="929292" w:sz="4" w:space="0" w:shadow="0" w:frame="0"/>
+              <w:right w:val="single" w:color="929292" w:sz="4" w:space="0" w:shadow="0" w:frame="0"/>
+            </w:tcBorders>
+            <w:shd w:val="clear" w:color="auto" w:fill="auto"/>
+            <w:tcMar>
+              <w:top w:type="dxa" w:w="80"/>
+              <w:left w:type="dxa" w:w="80"/>
+              <w:bottom w:type="dxa" w:w="80"/>
+              <w:right w:type="dxa" w:w="80"/>
+            </w:tcMar>
+            <w:vAlign w:val="top"/>
+          </w:tcPr>
           <w:p>
             <w:pPr>
               <w:pStyle w:val="Table Style 2"/>
@@ -741,7 +848,7 @@
         </w:tc>
         <w:tc>
           <w:tcPr>
-            <w:tcW w:type="dxa" w:w="1402"/>
+            <w:tcW w:type="dxa" w:w="1235"/>
             <w:tcBorders>
               <w:top w:val="single" w:color="929292" w:sz="4" w:space="0" w:shadow="0" w:frame="0"/>
               <w:left w:val="single" w:color="929292" w:sz="4" w:space="0" w:shadow="0" w:frame="0"/>
@@ -773,7 +880,7 @@
         </w:tc>
         <w:tc>
           <w:tcPr>
-            <w:tcW w:type="dxa" w:w="1253"/>
+            <w:tcW w:type="dxa" w:w="1104"/>
             <w:tcBorders>
               <w:top w:val="single" w:color="929292" w:sz="4" w:space="0" w:shadow="0" w:frame="0"/>
               <w:left w:val="single" w:color="929292" w:sz="4" w:space="0" w:shadow="0" w:frame="0"/>
@@ -851,7 +958,7 @@
         </w:trPr>
         <w:tc>
           <w:tcPr>
-            <w:tcW w:type="dxa" w:w="951"/>
+            <w:tcW w:type="dxa" w:w="838"/>
             <w:tcBorders>
               <w:top w:val="single" w:color="929292" w:sz="4" w:space="0" w:shadow="0" w:frame="0"/>
               <w:left w:val="single" w:color="929292" w:sz="4" w:space="0" w:shadow="0" w:frame="0"/>
@@ -883,7 +990,7 @@
         </w:tc>
         <w:tc>
           <w:tcPr>
-            <w:tcW w:type="dxa" w:w="4525"/>
+            <w:tcW w:type="dxa" w:w="3986"/>
             <w:tcBorders>
               <w:top w:val="single" w:color="929292" w:sz="4" w:space="0" w:shadow="0" w:frame="0"/>
               <w:left w:val="single" w:color="89847f" w:sz="8" w:space="0" w:shadow="0" w:frame="0"/>
@@ -915,7 +1022,7 @@
         </w:tc>
         <w:tc>
           <w:tcPr>
-            <w:tcW w:type="dxa" w:w="1151"/>
+            <w:tcW w:type="dxa" w:w="1104"/>
             <w:tcBorders>
               <w:top w:val="single" w:color="929292" w:sz="4" w:space="0" w:shadow="0" w:frame="0"/>
               <w:left w:val="single" w:color="929292" w:sz="4" w:space="0" w:shadow="0" w:frame="0"/>
@@ -931,6 +1038,26 @@
             </w:tcMar>
             <w:vAlign w:val="top"/>
           </w:tcPr>
+          <w:p/>
+        </w:tc>
+        <w:tc>
+          <w:tcPr>
+            <w:tcW w:type="dxa" w:w="1014"/>
+            <w:tcBorders>
+              <w:top w:val="single" w:color="929292" w:sz="4" w:space="0" w:shadow="0" w:frame="0"/>
+              <w:left w:val="single" w:color="929292" w:sz="4" w:space="0" w:shadow="0" w:frame="0"/>
+              <w:bottom w:val="single" w:color="929292" w:sz="4" w:space="0" w:shadow="0" w:frame="0"/>
+              <w:right w:val="single" w:color="929292" w:sz="4" w:space="0" w:shadow="0" w:frame="0"/>
+            </w:tcBorders>
+            <w:shd w:val="clear" w:color="auto" w:fill="f7f7f6"/>
+            <w:tcMar>
+              <w:top w:type="dxa" w:w="80"/>
+              <w:left w:type="dxa" w:w="80"/>
+              <w:bottom w:type="dxa" w:w="80"/>
+              <w:right w:type="dxa" w:w="80"/>
+            </w:tcMar>
+            <w:vAlign w:val="top"/>
+          </w:tcPr>
           <w:p>
             <w:pPr>
               <w:pStyle w:val="Table Style 2"/>
@@ -947,7 +1074,7 @@
         </w:tc>
         <w:tc>
           <w:tcPr>
-            <w:tcW w:type="dxa" w:w="1402"/>
+            <w:tcW w:type="dxa" w:w="1235"/>
             <w:tcBorders>
               <w:top w:val="single" w:color="929292" w:sz="4" w:space="0" w:shadow="0" w:frame="0"/>
               <w:left w:val="single" w:color="929292" w:sz="4" w:space="0" w:shadow="0" w:frame="0"/>
@@ -967,7 +1094,7 @@
         </w:tc>
         <w:tc>
           <w:tcPr>
-            <w:tcW w:type="dxa" w:w="1253"/>
+            <w:tcW w:type="dxa" w:w="1104"/>
             <w:tcBorders>
               <w:top w:val="single" w:color="929292" w:sz="4" w:space="0" w:shadow="0" w:frame="0"/>
               <w:left w:val="single" w:color="929292" w:sz="4" w:space="0" w:shadow="0" w:frame="0"/>
@@ -1041,11 +1168,11 @@
           <w:shd w:val="clear" w:color="auto" w:fill="auto"/>
         </w:tblPrEx>
         <w:trPr>
-          <w:trHeight w:val="295" w:hRule="atLeast"/>
+          <w:trHeight w:val="484" w:hRule="atLeast"/>
         </w:trPr>
         <w:tc>
           <w:tcPr>
-            <w:tcW w:type="dxa" w:w="951"/>
+            <w:tcW w:type="dxa" w:w="838"/>
             <w:tcBorders>
               <w:top w:val="single" w:color="929292" w:sz="4" w:space="0" w:shadow="0" w:frame="0"/>
               <w:left w:val="single" w:color="929292" w:sz="4" w:space="0" w:shadow="0" w:frame="0"/>
@@ -1077,7 +1204,7 @@
         </w:tc>
         <w:tc>
           <w:tcPr>
-            <w:tcW w:type="dxa" w:w="4525"/>
+            <w:tcW w:type="dxa" w:w="3986"/>
             <w:tcBorders>
               <w:top w:val="single" w:color="929292" w:sz="4" w:space="0" w:shadow="0" w:frame="0"/>
               <w:left w:val="single" w:color="89847f" w:sz="8" w:space="0" w:shadow="0" w:frame="0"/>
@@ -1109,7 +1236,7 @@
         </w:tc>
         <w:tc>
           <w:tcPr>
-            <w:tcW w:type="dxa" w:w="1151"/>
+            <w:tcW w:type="dxa" w:w="1104"/>
             <w:tcBorders>
               <w:top w:val="single" w:color="929292" w:sz="4" w:space="0" w:shadow="0" w:frame="0"/>
               <w:left w:val="single" w:color="929292" w:sz="4" w:space="0" w:shadow="0" w:frame="0"/>
@@ -1125,6 +1252,26 @@
             </w:tcMar>
             <w:vAlign w:val="top"/>
           </w:tcPr>
+          <w:p/>
+        </w:tc>
+        <w:tc>
+          <w:tcPr>
+            <w:tcW w:type="dxa" w:w="1014"/>
+            <w:tcBorders>
+              <w:top w:val="single" w:color="929292" w:sz="4" w:space="0" w:shadow="0" w:frame="0"/>
+              <w:left w:val="single" w:color="929292" w:sz="4" w:space="0" w:shadow="0" w:frame="0"/>
+              <w:bottom w:val="single" w:color="929292" w:sz="4" w:space="0" w:shadow="0" w:frame="0"/>
+              <w:right w:val="single" w:color="929292" w:sz="4" w:space="0" w:shadow="0" w:frame="0"/>
+            </w:tcBorders>
+            <w:shd w:val="clear" w:color="auto" w:fill="auto"/>
+            <w:tcMar>
+              <w:top w:type="dxa" w:w="80"/>
+              <w:left w:type="dxa" w:w="80"/>
+              <w:bottom w:type="dxa" w:w="80"/>
+              <w:right w:type="dxa" w:w="80"/>
+            </w:tcMar>
+            <w:vAlign w:val="top"/>
+          </w:tcPr>
           <w:p>
             <w:pPr>
               <w:pStyle w:val="Table Style 2"/>
@@ -1141,7 +1288,7 @@
         </w:tc>
         <w:tc>
           <w:tcPr>
-            <w:tcW w:type="dxa" w:w="1402"/>
+            <w:tcW w:type="dxa" w:w="1235"/>
             <w:tcBorders>
               <w:top w:val="single" w:color="929292" w:sz="4" w:space="0" w:shadow="0" w:frame="0"/>
               <w:left w:val="single" w:color="929292" w:sz="4" w:space="0" w:shadow="0" w:frame="0"/>
@@ -1161,7 +1308,7 @@
         </w:tc>
         <w:tc>
           <w:tcPr>
-            <w:tcW w:type="dxa" w:w="1253"/>
+            <w:tcW w:type="dxa" w:w="1104"/>
             <w:tcBorders>
               <w:top w:val="single" w:color="929292" w:sz="4" w:space="0" w:shadow="0" w:frame="0"/>
               <w:left w:val="single" w:color="929292" w:sz="4" w:space="0" w:shadow="0" w:frame="0"/>
@@ -1235,11 +1382,11 @@
           <w:shd w:val="clear" w:color="auto" w:fill="auto"/>
         </w:tblPrEx>
         <w:trPr>
-          <w:trHeight w:val="295" w:hRule="atLeast"/>
+          <w:trHeight w:val="484" w:hRule="atLeast"/>
         </w:trPr>
         <w:tc>
           <w:tcPr>
-            <w:tcW w:type="dxa" w:w="951"/>
+            <w:tcW w:type="dxa" w:w="838"/>
             <w:tcBorders>
               <w:top w:val="single" w:color="929292" w:sz="4" w:space="0" w:shadow="0" w:frame="0"/>
               <w:left w:val="single" w:color="929292" w:sz="4" w:space="0" w:shadow="0" w:frame="0"/>
@@ -1271,7 +1418,7 @@
         </w:tc>
         <w:tc>
           <w:tcPr>
-            <w:tcW w:type="dxa" w:w="4525"/>
+            <w:tcW w:type="dxa" w:w="3986"/>
             <w:tcBorders>
               <w:top w:val="single" w:color="929292" w:sz="4" w:space="0" w:shadow="0" w:frame="0"/>
               <w:left w:val="single" w:color="89847f" w:sz="8" w:space="0" w:shadow="0" w:frame="0"/>
@@ -1303,7 +1450,7 @@
         </w:tc>
         <w:tc>
           <w:tcPr>
-            <w:tcW w:type="dxa" w:w="1151"/>
+            <w:tcW w:type="dxa" w:w="1104"/>
             <w:tcBorders>
               <w:top w:val="single" w:color="929292" w:sz="4" w:space="0" w:shadow="0" w:frame="0"/>
               <w:left w:val="single" w:color="929292" w:sz="4" w:space="0" w:shadow="0" w:frame="0"/>
@@ -1327,6 +1474,45 @@
             <w:r>
               <w:rPr>
                 <w:rFonts w:ascii="Helvetica Neue" w:hAnsi="Helvetica Neue"/>
+                <w:outline w:val="0"/>
+                <w:color w:val="295ff4"/>
+                <w:rtl w:val="0"/>
+                <w14:textFill>
+                  <w14:solidFill>
+                    <w14:srgbClr w14:val="295FF4"/>
+                  </w14:solidFill>
+                </w14:textFill>
+              </w:rPr>
+              <w:t>CH02 P07</w:t>
+            </w:r>
+          </w:p>
+        </w:tc>
+        <w:tc>
+          <w:tcPr>
+            <w:tcW w:type="dxa" w:w="1014"/>
+            <w:tcBorders>
+              <w:top w:val="single" w:color="929292" w:sz="4" w:space="0" w:shadow="0" w:frame="0"/>
+              <w:left w:val="single" w:color="929292" w:sz="4" w:space="0" w:shadow="0" w:frame="0"/>
+              <w:bottom w:val="single" w:color="929292" w:sz="4" w:space="0" w:shadow="0" w:frame="0"/>
+              <w:right w:val="single" w:color="929292" w:sz="4" w:space="0" w:shadow="0" w:frame="0"/>
+            </w:tcBorders>
+            <w:shd w:val="clear" w:color="auto" w:fill="f7f7f6"/>
+            <w:tcMar>
+              <w:top w:type="dxa" w:w="80"/>
+              <w:left w:type="dxa" w:w="80"/>
+              <w:bottom w:type="dxa" w:w="80"/>
+              <w:right w:type="dxa" w:w="80"/>
+            </w:tcMar>
+            <w:vAlign w:val="top"/>
+          </w:tcPr>
+          <w:p>
+            <w:pPr>
+              <w:pStyle w:val="Table Style 2"/>
+              <w:jc w:val="center"/>
+            </w:pPr>
+            <w:r>
+              <w:rPr>
+                <w:rFonts w:ascii="Helvetica Neue" w:hAnsi="Helvetica Neue"/>
                 <w:rtl w:val="0"/>
               </w:rPr>
               <w:t>2</w:t>
@@ -1335,7 +1521,7 @@
         </w:tc>
         <w:tc>
           <w:tcPr>
-            <w:tcW w:type="dxa" w:w="1402"/>
+            <w:tcW w:type="dxa" w:w="1235"/>
             <w:tcBorders>
               <w:top w:val="single" w:color="929292" w:sz="4" w:space="0" w:shadow="0" w:frame="0"/>
               <w:left w:val="single" w:color="929292" w:sz="4" w:space="0" w:shadow="0" w:frame="0"/>
@@ -1355,7 +1541,7 @@
         </w:tc>
         <w:tc>
           <w:tcPr>
-            <w:tcW w:type="dxa" w:w="1253"/>
+            <w:tcW w:type="dxa" w:w="1104"/>
             <w:tcBorders>
               <w:top w:val="single" w:color="929292" w:sz="4" w:space="0" w:shadow="0" w:frame="0"/>
               <w:left w:val="single" w:color="929292" w:sz="4" w:space="0" w:shadow="0" w:frame="0"/>
@@ -1429,11 +1615,11 @@
           <w:shd w:val="clear" w:color="auto" w:fill="auto"/>
         </w:tblPrEx>
         <w:trPr>
-          <w:trHeight w:val="295" w:hRule="atLeast"/>
+          <w:trHeight w:val="484" w:hRule="atLeast"/>
         </w:trPr>
         <w:tc>
           <w:tcPr>
-            <w:tcW w:type="dxa" w:w="951"/>
+            <w:tcW w:type="dxa" w:w="838"/>
             <w:tcBorders>
               <w:top w:val="single" w:color="929292" w:sz="4" w:space="0" w:shadow="0" w:frame="0"/>
               <w:left w:val="single" w:color="929292" w:sz="4" w:space="0" w:shadow="0" w:frame="0"/>
@@ -1465,7 +1651,7 @@
         </w:tc>
         <w:tc>
           <w:tcPr>
-            <w:tcW w:type="dxa" w:w="4525"/>
+            <w:tcW w:type="dxa" w:w="3986"/>
             <w:tcBorders>
               <w:top w:val="single" w:color="929292" w:sz="4" w:space="0" w:shadow="0" w:frame="0"/>
               <w:left w:val="single" w:color="89847f" w:sz="8" w:space="0" w:shadow="0" w:frame="0"/>
@@ -1497,7 +1683,7 @@
         </w:tc>
         <w:tc>
           <w:tcPr>
-            <w:tcW w:type="dxa" w:w="1151"/>
+            <w:tcW w:type="dxa" w:w="1104"/>
             <w:tcBorders>
               <w:top w:val="single" w:color="929292" w:sz="4" w:space="0" w:shadow="0" w:frame="0"/>
               <w:left w:val="single" w:color="929292" w:sz="4" w:space="0" w:shadow="0" w:frame="0"/>
@@ -1521,6 +1707,45 @@
             <w:r>
               <w:rPr>
                 <w:rFonts w:ascii="Helvetica Neue" w:hAnsi="Helvetica Neue"/>
+                <w:outline w:val="0"/>
+                <w:color w:val="295ff4"/>
+                <w:rtl w:val="0"/>
+                <w14:textFill>
+                  <w14:solidFill>
+                    <w14:srgbClr w14:val="295FF4"/>
+                  </w14:solidFill>
+                </w14:textFill>
+              </w:rPr>
+              <w:t>NA</w:t>
+            </w:r>
+          </w:p>
+        </w:tc>
+        <w:tc>
+          <w:tcPr>
+            <w:tcW w:type="dxa" w:w="1014"/>
+            <w:tcBorders>
+              <w:top w:val="single" w:color="929292" w:sz="4" w:space="0" w:shadow="0" w:frame="0"/>
+              <w:left w:val="single" w:color="929292" w:sz="4" w:space="0" w:shadow="0" w:frame="0"/>
+              <w:bottom w:val="single" w:color="929292" w:sz="4" w:space="0" w:shadow="0" w:frame="0"/>
+              <w:right w:val="single" w:color="929292" w:sz="4" w:space="0" w:shadow="0" w:frame="0"/>
+            </w:tcBorders>
+            <w:shd w:val="clear" w:color="auto" w:fill="auto"/>
+            <w:tcMar>
+              <w:top w:type="dxa" w:w="80"/>
+              <w:left w:type="dxa" w:w="80"/>
+              <w:bottom w:type="dxa" w:w="80"/>
+              <w:right w:type="dxa" w:w="80"/>
+            </w:tcMar>
+            <w:vAlign w:val="top"/>
+          </w:tcPr>
+          <w:p>
+            <w:pPr>
+              <w:pStyle w:val="Table Style 2"/>
+              <w:jc w:val="center"/>
+            </w:pPr>
+            <w:r>
+              <w:rPr>
+                <w:rFonts w:ascii="Helvetica Neue" w:hAnsi="Helvetica Neue"/>
                 <w:rtl w:val="0"/>
               </w:rPr>
               <w:t>2</w:t>
@@ -1529,7 +1754,7 @@
         </w:tc>
         <w:tc>
           <w:tcPr>
-            <w:tcW w:type="dxa" w:w="1402"/>
+            <w:tcW w:type="dxa" w:w="1235"/>
             <w:tcBorders>
               <w:top w:val="single" w:color="929292" w:sz="4" w:space="0" w:shadow="0" w:frame="0"/>
               <w:left w:val="single" w:color="929292" w:sz="4" w:space="0" w:shadow="0" w:frame="0"/>
@@ -1561,7 +1786,7 @@
         </w:tc>
         <w:tc>
           <w:tcPr>
-            <w:tcW w:type="dxa" w:w="1253"/>
+            <w:tcW w:type="dxa" w:w="1104"/>
             <w:tcBorders>
               <w:top w:val="single" w:color="929292" w:sz="4" w:space="0" w:shadow="0" w:frame="0"/>
               <w:left w:val="single" w:color="929292" w:sz="4" w:space="0" w:shadow="0" w:frame="0"/>
@@ -1639,7 +1864,7 @@
         </w:trPr>
         <w:tc>
           <w:tcPr>
-            <w:tcW w:type="dxa" w:w="951"/>
+            <w:tcW w:type="dxa" w:w="838"/>
             <w:tcBorders>
               <w:top w:val="single" w:color="929292" w:sz="4" w:space="0" w:shadow="0" w:frame="0"/>
               <w:left w:val="single" w:color="929292" w:sz="4" w:space="0" w:shadow="0" w:frame="0"/>
@@ -1671,7 +1896,7 @@
         </w:tc>
         <w:tc>
           <w:tcPr>
-            <w:tcW w:type="dxa" w:w="4525"/>
+            <w:tcW w:type="dxa" w:w="3986"/>
             <w:tcBorders>
               <w:top w:val="single" w:color="929292" w:sz="4" w:space="0" w:shadow="0" w:frame="0"/>
               <w:left w:val="single" w:color="89847f" w:sz="8" w:space="0" w:shadow="0" w:frame="0"/>
@@ -1703,7 +1928,7 @@
         </w:tc>
         <w:tc>
           <w:tcPr>
-            <w:tcW w:type="dxa" w:w="1151"/>
+            <w:tcW w:type="dxa" w:w="1104"/>
             <w:tcBorders>
               <w:top w:val="single" w:color="929292" w:sz="4" w:space="0" w:shadow="0" w:frame="0"/>
               <w:left w:val="single" w:color="929292" w:sz="4" w:space="0" w:shadow="0" w:frame="0"/>
@@ -1723,7 +1948,7 @@
         </w:tc>
         <w:tc>
           <w:tcPr>
-            <w:tcW w:type="dxa" w:w="1402"/>
+            <w:tcW w:type="dxa" w:w="1014"/>
             <w:tcBorders>
               <w:top w:val="single" w:color="929292" w:sz="4" w:space="0" w:shadow="0" w:frame="0"/>
               <w:left w:val="single" w:color="929292" w:sz="4" w:space="0" w:shadow="0" w:frame="0"/>
@@ -1739,11 +1964,43 @@
             </w:tcMar>
             <w:vAlign w:val="top"/>
           </w:tcPr>
+          <w:p>
+            <w:pPr>
+              <w:pStyle w:val="Table Style 2"/>
+              <w:jc w:val="center"/>
+            </w:pPr>
+            <w:r>
+              <w:rPr>
+                <w:rFonts w:ascii="Helvetica Neue" w:hAnsi="Helvetica Neue"/>
+                <w:rtl w:val="0"/>
+              </w:rPr>
+              <w:t>1/7</w:t>
+            </w:r>
+          </w:p>
+        </w:tc>
+        <w:tc>
+          <w:tcPr>
+            <w:tcW w:type="dxa" w:w="1235"/>
+            <w:tcBorders>
+              <w:top w:val="single" w:color="929292" w:sz="4" w:space="0" w:shadow="0" w:frame="0"/>
+              <w:left w:val="single" w:color="929292" w:sz="4" w:space="0" w:shadow="0" w:frame="0"/>
+              <w:bottom w:val="single" w:color="929292" w:sz="4" w:space="0" w:shadow="0" w:frame="0"/>
+              <w:right w:val="single" w:color="929292" w:sz="4" w:space="0" w:shadow="0" w:frame="0"/>
+            </w:tcBorders>
+            <w:shd w:val="clear" w:color="auto" w:fill="f7f7f6"/>
+            <w:tcMar>
+              <w:top w:type="dxa" w:w="80"/>
+              <w:left w:type="dxa" w:w="80"/>
+              <w:bottom w:type="dxa" w:w="80"/>
+              <w:right w:type="dxa" w:w="80"/>
+            </w:tcMar>
+            <w:vAlign w:val="top"/>
+          </w:tcPr>
           <w:p/>
         </w:tc>
         <w:tc>
           <w:tcPr>
-            <w:tcW w:type="dxa" w:w="1253"/>
+            <w:tcW w:type="dxa" w:w="1104"/>
             <w:tcBorders>
               <w:top w:val="single" w:color="929292" w:sz="4" w:space="0" w:shadow="0" w:frame="0"/>
               <w:left w:val="single" w:color="929292" w:sz="4" w:space="0" w:shadow="0" w:frame="0"/>
@@ -1821,7 +2078,7 @@
         </w:trPr>
         <w:tc>
           <w:tcPr>
-            <w:tcW w:type="dxa" w:w="951"/>
+            <w:tcW w:type="dxa" w:w="838"/>
             <w:tcBorders>
               <w:top w:val="single" w:color="929292" w:sz="4" w:space="0" w:shadow="0" w:frame="0"/>
               <w:left w:val="single" w:color="929292" w:sz="4" w:space="0" w:shadow="0" w:frame="0"/>
@@ -1853,7 +2110,7 @@
         </w:tc>
         <w:tc>
           <w:tcPr>
-            <w:tcW w:type="dxa" w:w="4525"/>
+            <w:tcW w:type="dxa" w:w="3986"/>
             <w:tcBorders>
               <w:top w:val="single" w:color="929292" w:sz="4" w:space="0" w:shadow="0" w:frame="0"/>
               <w:left w:val="single" w:color="89847f" w:sz="8" w:space="0" w:shadow="0" w:frame="0"/>
@@ -1885,7 +2142,7 @@
         </w:tc>
         <w:tc>
           <w:tcPr>
-            <w:tcW w:type="dxa" w:w="1151"/>
+            <w:tcW w:type="dxa" w:w="1104"/>
             <w:tcBorders>
               <w:top w:val="single" w:color="929292" w:sz="4" w:space="0" w:shadow="0" w:frame="0"/>
               <w:left w:val="single" w:color="929292" w:sz="4" w:space="0" w:shadow="0" w:frame="0"/>
@@ -1901,6 +2158,26 @@
             </w:tcMar>
             <w:vAlign w:val="top"/>
           </w:tcPr>
+          <w:p/>
+        </w:tc>
+        <w:tc>
+          <w:tcPr>
+            <w:tcW w:type="dxa" w:w="1014"/>
+            <w:tcBorders>
+              <w:top w:val="single" w:color="929292" w:sz="4" w:space="0" w:shadow="0" w:frame="0"/>
+              <w:left w:val="single" w:color="929292" w:sz="4" w:space="0" w:shadow="0" w:frame="0"/>
+              <w:bottom w:val="single" w:color="929292" w:sz="4" w:space="0" w:shadow="0" w:frame="0"/>
+              <w:right w:val="single" w:color="929292" w:sz="4" w:space="0" w:shadow="0" w:frame="0"/>
+            </w:tcBorders>
+            <w:shd w:val="clear" w:color="auto" w:fill="auto"/>
+            <w:tcMar>
+              <w:top w:type="dxa" w:w="80"/>
+              <w:left w:type="dxa" w:w="80"/>
+              <w:bottom w:type="dxa" w:w="80"/>
+              <w:right w:type="dxa" w:w="80"/>
+            </w:tcMar>
+            <w:vAlign w:val="top"/>
+          </w:tcPr>
           <w:p>
             <w:pPr>
               <w:pStyle w:val="Table Style 2"/>
@@ -1917,7 +2194,7 @@
         </w:tc>
         <w:tc>
           <w:tcPr>
-            <w:tcW w:type="dxa" w:w="1402"/>
+            <w:tcW w:type="dxa" w:w="1235"/>
             <w:tcBorders>
               <w:top w:val="single" w:color="929292" w:sz="4" w:space="0" w:shadow="0" w:frame="0"/>
               <w:left w:val="single" w:color="929292" w:sz="4" w:space="0" w:shadow="0" w:frame="0"/>
@@ -1949,7 +2226,7 @@
         </w:tc>
         <w:tc>
           <w:tcPr>
-            <w:tcW w:type="dxa" w:w="1253"/>
+            <w:tcW w:type="dxa" w:w="1104"/>
             <w:tcBorders>
               <w:top w:val="single" w:color="929292" w:sz="4" w:space="0" w:shadow="0" w:frame="0"/>
               <w:left w:val="single" w:color="929292" w:sz="4" w:space="0" w:shadow="0" w:frame="0"/>
@@ -2027,7 +2304,7 @@
         </w:trPr>
         <w:tc>
           <w:tcPr>
-            <w:tcW w:type="dxa" w:w="951"/>
+            <w:tcW w:type="dxa" w:w="838"/>
             <w:tcBorders>
               <w:top w:val="single" w:color="929292" w:sz="4" w:space="0" w:shadow="0" w:frame="0"/>
               <w:left w:val="single" w:color="929292" w:sz="4" w:space="0" w:shadow="0" w:frame="0"/>
@@ -2059,7 +2336,7 @@
         </w:tc>
         <w:tc>
           <w:tcPr>
-            <w:tcW w:type="dxa" w:w="4525"/>
+            <w:tcW w:type="dxa" w:w="3986"/>
             <w:tcBorders>
               <w:top w:val="single" w:color="929292" w:sz="4" w:space="0" w:shadow="0" w:frame="0"/>
               <w:left w:val="single" w:color="89847f" w:sz="8" w:space="0" w:shadow="0" w:frame="0"/>
@@ -2091,7 +2368,7 @@
         </w:tc>
         <w:tc>
           <w:tcPr>
-            <w:tcW w:type="dxa" w:w="1151"/>
+            <w:tcW w:type="dxa" w:w="1104"/>
             <w:tcBorders>
               <w:top w:val="single" w:color="929292" w:sz="4" w:space="0" w:shadow="0" w:frame="0"/>
               <w:left w:val="single" w:color="929292" w:sz="4" w:space="0" w:shadow="0" w:frame="0"/>
@@ -2107,6 +2384,26 @@
             </w:tcMar>
             <w:vAlign w:val="top"/>
           </w:tcPr>
+          <w:p/>
+        </w:tc>
+        <w:tc>
+          <w:tcPr>
+            <w:tcW w:type="dxa" w:w="1014"/>
+            <w:tcBorders>
+              <w:top w:val="single" w:color="929292" w:sz="4" w:space="0" w:shadow="0" w:frame="0"/>
+              <w:left w:val="single" w:color="929292" w:sz="4" w:space="0" w:shadow="0" w:frame="0"/>
+              <w:bottom w:val="single" w:color="929292" w:sz="4" w:space="0" w:shadow="0" w:frame="0"/>
+              <w:right w:val="single" w:color="929292" w:sz="4" w:space="0" w:shadow="0" w:frame="0"/>
+            </w:tcBorders>
+            <w:shd w:val="clear" w:color="auto" w:fill="f7f7f6"/>
+            <w:tcMar>
+              <w:top w:type="dxa" w:w="80"/>
+              <w:left w:type="dxa" w:w="80"/>
+              <w:bottom w:type="dxa" w:w="80"/>
+              <w:right w:type="dxa" w:w="80"/>
+            </w:tcMar>
+            <w:vAlign w:val="top"/>
+          </w:tcPr>
           <w:p>
             <w:pPr>
               <w:pStyle w:val="Table Style 2"/>
@@ -2123,7 +2420,7 @@
         </w:tc>
         <w:tc>
           <w:tcPr>
-            <w:tcW w:type="dxa" w:w="1402"/>
+            <w:tcW w:type="dxa" w:w="1235"/>
             <w:tcBorders>
               <w:top w:val="single" w:color="929292" w:sz="4" w:space="0" w:shadow="0" w:frame="0"/>
               <w:left w:val="single" w:color="929292" w:sz="4" w:space="0" w:shadow="0" w:frame="0"/>
@@ -2143,7 +2440,7 @@
         </w:tc>
         <w:tc>
           <w:tcPr>
-            <w:tcW w:type="dxa" w:w="1253"/>
+            <w:tcW w:type="dxa" w:w="1104"/>
             <w:tcBorders>
               <w:top w:val="single" w:color="929292" w:sz="4" w:space="0" w:shadow="0" w:frame="0"/>
               <w:left w:val="single" w:color="929292" w:sz="4" w:space="0" w:shadow="0" w:frame="0"/>
@@ -2221,7 +2518,7 @@
         </w:trPr>
         <w:tc>
           <w:tcPr>
-            <w:tcW w:type="dxa" w:w="951"/>
+            <w:tcW w:type="dxa" w:w="838"/>
             <w:tcBorders>
               <w:top w:val="single" w:color="929292" w:sz="4" w:space="0" w:shadow="0" w:frame="0"/>
               <w:left w:val="single" w:color="929292" w:sz="4" w:space="0" w:shadow="0" w:frame="0"/>
@@ -2253,7 +2550,7 @@
         </w:tc>
         <w:tc>
           <w:tcPr>
-            <w:tcW w:type="dxa" w:w="4525"/>
+            <w:tcW w:type="dxa" w:w="3986"/>
             <w:tcBorders>
               <w:top w:val="single" w:color="929292" w:sz="4" w:space="0" w:shadow="0" w:frame="0"/>
               <w:left w:val="single" w:color="89847f" w:sz="8" w:space="0" w:shadow="0" w:frame="0"/>
@@ -2285,7 +2582,7 @@
         </w:tc>
         <w:tc>
           <w:tcPr>
-            <w:tcW w:type="dxa" w:w="1151"/>
+            <w:tcW w:type="dxa" w:w="1104"/>
             <w:tcBorders>
               <w:top w:val="single" w:color="929292" w:sz="4" w:space="0" w:shadow="0" w:frame="0"/>
               <w:left w:val="single" w:color="929292" w:sz="4" w:space="0" w:shadow="0" w:frame="0"/>
@@ -2301,6 +2598,26 @@
             </w:tcMar>
             <w:vAlign w:val="top"/>
           </w:tcPr>
+          <w:p/>
+        </w:tc>
+        <w:tc>
+          <w:tcPr>
+            <w:tcW w:type="dxa" w:w="1014"/>
+            <w:tcBorders>
+              <w:top w:val="single" w:color="929292" w:sz="4" w:space="0" w:shadow="0" w:frame="0"/>
+              <w:left w:val="single" w:color="929292" w:sz="4" w:space="0" w:shadow="0" w:frame="0"/>
+              <w:bottom w:val="single" w:color="929292" w:sz="4" w:space="0" w:shadow="0" w:frame="0"/>
+              <w:right w:val="single" w:color="929292" w:sz="4" w:space="0" w:shadow="0" w:frame="0"/>
+            </w:tcBorders>
+            <w:shd w:val="clear" w:color="auto" w:fill="auto"/>
+            <w:tcMar>
+              <w:top w:type="dxa" w:w="80"/>
+              <w:left w:type="dxa" w:w="80"/>
+              <w:bottom w:type="dxa" w:w="80"/>
+              <w:right w:type="dxa" w:w="80"/>
+            </w:tcMar>
+            <w:vAlign w:val="top"/>
+          </w:tcPr>
           <w:p>
             <w:pPr>
               <w:pStyle w:val="Table Style 2"/>
@@ -2317,7 +2634,7 @@
         </w:tc>
         <w:tc>
           <w:tcPr>
-            <w:tcW w:type="dxa" w:w="1402"/>
+            <w:tcW w:type="dxa" w:w="1235"/>
             <w:tcBorders>
               <w:top w:val="single" w:color="929292" w:sz="4" w:space="0" w:shadow="0" w:frame="0"/>
               <w:left w:val="single" w:color="929292" w:sz="4" w:space="0" w:shadow="0" w:frame="0"/>
@@ -2349,7 +2666,7 @@
         </w:tc>
         <w:tc>
           <w:tcPr>
-            <w:tcW w:type="dxa" w:w="1253"/>
+            <w:tcW w:type="dxa" w:w="1104"/>
             <w:tcBorders>
               <w:top w:val="single" w:color="929292" w:sz="4" w:space="0" w:shadow="0" w:frame="0"/>
               <w:left w:val="single" w:color="929292" w:sz="4" w:space="0" w:shadow="0" w:frame="0"/>
@@ -2427,7 +2744,7 @@
         </w:trPr>
         <w:tc>
           <w:tcPr>
-            <w:tcW w:type="dxa" w:w="951"/>
+            <w:tcW w:type="dxa" w:w="838"/>
             <w:tcBorders>
               <w:top w:val="single" w:color="929292" w:sz="4" w:space="0" w:shadow="0" w:frame="0"/>
               <w:left w:val="single" w:color="929292" w:sz="4" w:space="0" w:shadow="0" w:frame="0"/>
@@ -2459,7 +2776,7 @@
         </w:tc>
         <w:tc>
           <w:tcPr>
-            <w:tcW w:type="dxa" w:w="4525"/>
+            <w:tcW w:type="dxa" w:w="3986"/>
             <w:tcBorders>
               <w:top w:val="single" w:color="929292" w:sz="4" w:space="0" w:shadow="0" w:frame="0"/>
               <w:left w:val="single" w:color="89847f" w:sz="8" w:space="0" w:shadow="0" w:frame="0"/>
@@ -2491,7 +2808,7 @@
         </w:tc>
         <w:tc>
           <w:tcPr>
-            <w:tcW w:type="dxa" w:w="1151"/>
+            <w:tcW w:type="dxa" w:w="1104"/>
             <w:tcBorders>
               <w:top w:val="single" w:color="929292" w:sz="4" w:space="0" w:shadow="0" w:frame="0"/>
               <w:left w:val="single" w:color="929292" w:sz="4" w:space="0" w:shadow="0" w:frame="0"/>
@@ -2507,6 +2824,26 @@
             </w:tcMar>
             <w:vAlign w:val="top"/>
           </w:tcPr>
+          <w:p/>
+        </w:tc>
+        <w:tc>
+          <w:tcPr>
+            <w:tcW w:type="dxa" w:w="1014"/>
+            <w:tcBorders>
+              <w:top w:val="single" w:color="929292" w:sz="4" w:space="0" w:shadow="0" w:frame="0"/>
+              <w:left w:val="single" w:color="929292" w:sz="4" w:space="0" w:shadow="0" w:frame="0"/>
+              <w:bottom w:val="single" w:color="929292" w:sz="4" w:space="0" w:shadow="0" w:frame="0"/>
+              <w:right w:val="single" w:color="929292" w:sz="4" w:space="0" w:shadow="0" w:frame="0"/>
+            </w:tcBorders>
+            <w:shd w:val="clear" w:color="auto" w:fill="f7f7f6"/>
+            <w:tcMar>
+              <w:top w:type="dxa" w:w="80"/>
+              <w:left w:type="dxa" w:w="80"/>
+              <w:bottom w:type="dxa" w:w="80"/>
+              <w:right w:type="dxa" w:w="80"/>
+            </w:tcMar>
+            <w:vAlign w:val="top"/>
+          </w:tcPr>
           <w:p>
             <w:pPr>
               <w:pStyle w:val="Table Style 2"/>
@@ -2523,7 +2860,7 @@
         </w:tc>
         <w:tc>
           <w:tcPr>
-            <w:tcW w:type="dxa" w:w="1402"/>
+            <w:tcW w:type="dxa" w:w="1235"/>
             <w:tcBorders>
               <w:top w:val="single" w:color="929292" w:sz="4" w:space="0" w:shadow="0" w:frame="0"/>
               <w:left w:val="single" w:color="929292" w:sz="4" w:space="0" w:shadow="0" w:frame="0"/>
@@ -2555,7 +2892,7 @@
         </w:tc>
         <w:tc>
           <w:tcPr>
-            <w:tcW w:type="dxa" w:w="1253"/>
+            <w:tcW w:type="dxa" w:w="1104"/>
             <w:tcBorders>
               <w:top w:val="single" w:color="929292" w:sz="4" w:space="0" w:shadow="0" w:frame="0"/>
               <w:left w:val="single" w:color="929292" w:sz="4" w:space="0" w:shadow="0" w:frame="0"/>
@@ -2629,11 +2966,11 @@
           <w:shd w:val="clear" w:color="auto" w:fill="auto"/>
         </w:tblPrEx>
         <w:trPr>
-          <w:trHeight w:val="295" w:hRule="atLeast"/>
+          <w:trHeight w:val="484" w:hRule="atLeast"/>
         </w:trPr>
         <w:tc>
           <w:tcPr>
-            <w:tcW w:type="dxa" w:w="951"/>
+            <w:tcW w:type="dxa" w:w="838"/>
             <w:tcBorders>
               <w:top w:val="single" w:color="929292" w:sz="4" w:space="0" w:shadow="0" w:frame="0"/>
               <w:left w:val="single" w:color="929292" w:sz="4" w:space="0" w:shadow="0" w:frame="0"/>
@@ -2665,7 +3002,7 @@
         </w:tc>
         <w:tc>
           <w:tcPr>
-            <w:tcW w:type="dxa" w:w="4525"/>
+            <w:tcW w:type="dxa" w:w="3986"/>
             <w:tcBorders>
               <w:top w:val="single" w:color="929292" w:sz="4" w:space="0" w:shadow="0" w:frame="0"/>
               <w:left w:val="single" w:color="89847f" w:sz="8" w:space="0" w:shadow="0" w:frame="0"/>
@@ -2697,7 +3034,7 @@
         </w:tc>
         <w:tc>
           <w:tcPr>
-            <w:tcW w:type="dxa" w:w="1151"/>
+            <w:tcW w:type="dxa" w:w="1104"/>
             <w:tcBorders>
               <w:top w:val="single" w:color="929292" w:sz="4" w:space="0" w:shadow="0" w:frame="0"/>
               <w:left w:val="single" w:color="929292" w:sz="4" w:space="0" w:shadow="0" w:frame="0"/>
@@ -2713,11 +3050,50 @@
             </w:tcMar>
             <w:vAlign w:val="top"/>
           </w:tcPr>
+          <w:p>
+            <w:pPr>
+              <w:pStyle w:val="Table Style 2"/>
+              <w:jc w:val="center"/>
+            </w:pPr>
+            <w:r>
+              <w:rPr>
+                <w:rFonts w:ascii="Helvetica Neue" w:hAnsi="Helvetica Neue"/>
+                <w:outline w:val="0"/>
+                <w:color w:val="295ff4"/>
+                <w:rtl w:val="0"/>
+                <w14:textFill>
+                  <w14:solidFill>
+                    <w14:srgbClr w14:val="295FF4"/>
+                  </w14:solidFill>
+                </w14:textFill>
+              </w:rPr>
+              <w:t>CH02 P85</w:t>
+            </w:r>
+          </w:p>
+        </w:tc>
+        <w:tc>
+          <w:tcPr>
+            <w:tcW w:type="dxa" w:w="1014"/>
+            <w:tcBorders>
+              <w:top w:val="single" w:color="929292" w:sz="4" w:space="0" w:shadow="0" w:frame="0"/>
+              <w:left w:val="single" w:color="929292" w:sz="4" w:space="0" w:shadow="0" w:frame="0"/>
+              <w:bottom w:val="single" w:color="929292" w:sz="4" w:space="0" w:shadow="0" w:frame="0"/>
+              <w:right w:val="single" w:color="929292" w:sz="4" w:space="0" w:shadow="0" w:frame="0"/>
+            </w:tcBorders>
+            <w:shd w:val="clear" w:color="auto" w:fill="auto"/>
+            <w:tcMar>
+              <w:top w:type="dxa" w:w="80"/>
+              <w:left w:type="dxa" w:w="80"/>
+              <w:bottom w:type="dxa" w:w="80"/>
+              <w:right w:type="dxa" w:w="80"/>
+            </w:tcMar>
+            <w:vAlign w:val="top"/>
+          </w:tcPr>
           <w:p/>
         </w:tc>
         <w:tc>
           <w:tcPr>
-            <w:tcW w:type="dxa" w:w="1402"/>
+            <w:tcW w:type="dxa" w:w="1235"/>
             <w:tcBorders>
               <w:top w:val="single" w:color="929292" w:sz="4" w:space="0" w:shadow="0" w:frame="0"/>
               <w:left w:val="single" w:color="929292" w:sz="4" w:space="0" w:shadow="0" w:frame="0"/>
@@ -2737,14 +3113,14 @@
         </w:tc>
         <w:tc>
           <w:tcPr>
-            <w:tcW w:type="dxa" w:w="1253"/>
-            <w:tcBorders>
-              <w:top w:val="single" w:color="929292" w:sz="4" w:space="0" w:shadow="0" w:frame="0"/>
-              <w:left w:val="single" w:color="929292" w:sz="4" w:space="0" w:shadow="0" w:frame="0"/>
-              <w:bottom w:val="single" w:color="929292" w:sz="4" w:space="0" w:shadow="0" w:frame="0"/>
-              <w:right w:val="single" w:color="929292" w:sz="4" w:space="0" w:shadow="0" w:frame="0"/>
-            </w:tcBorders>
-            <w:shd w:val="clear" w:color="auto" w:fill="295ff4"/>
+            <w:tcW w:type="dxa" w:w="1104"/>
+            <w:tcBorders>
+              <w:top w:val="single" w:color="929292" w:sz="4" w:space="0" w:shadow="0" w:frame="0"/>
+              <w:left w:val="single" w:color="929292" w:sz="4" w:space="0" w:shadow="0" w:frame="0"/>
+              <w:bottom w:val="single" w:color="929292" w:sz="4" w:space="0" w:shadow="0" w:frame="0"/>
+              <w:right w:val="single" w:color="929292" w:sz="4" w:space="0" w:shadow="0" w:frame="0"/>
+            </w:tcBorders>
+            <w:shd w:val="clear" w:color="auto" w:fill="782cf6"/>
             <w:tcMar>
               <w:top w:type="dxa" w:w="80"/>
               <w:left w:type="dxa" w:w="80"/>
@@ -2801,7 +3177,7 @@
                   </w14:solidFill>
                 </w14:textFill>
               </w:rPr>
-              <w:t>Open</w:t>
+              <w:t>In progress</w:t>
             </w:r>
           </w:p>
         </w:tc>
@@ -2815,7 +3191,7 @@
         </w:trPr>
         <w:tc>
           <w:tcPr>
-            <w:tcW w:type="dxa" w:w="951"/>
+            <w:tcW w:type="dxa" w:w="838"/>
             <w:tcBorders>
               <w:top w:val="single" w:color="929292" w:sz="4" w:space="0" w:shadow="0" w:frame="0"/>
               <w:left w:val="single" w:color="929292" w:sz="4" w:space="0" w:shadow="0" w:frame="0"/>
@@ -2847,7 +3223,7 @@
         </w:tc>
         <w:tc>
           <w:tcPr>
-            <w:tcW w:type="dxa" w:w="4525"/>
+            <w:tcW w:type="dxa" w:w="3986"/>
             <w:tcBorders>
               <w:top w:val="single" w:color="929292" w:sz="4" w:space="0" w:shadow="0" w:frame="0"/>
               <w:left w:val="single" w:color="89847f" w:sz="8" w:space="0" w:shadow="0" w:frame="0"/>
@@ -2879,7 +3255,7 @@
         </w:tc>
         <w:tc>
           <w:tcPr>
-            <w:tcW w:type="dxa" w:w="1151"/>
+            <w:tcW w:type="dxa" w:w="1104"/>
             <w:tcBorders>
               <w:top w:val="single" w:color="929292" w:sz="4" w:space="0" w:shadow="0" w:frame="0"/>
               <w:left w:val="single" w:color="929292" w:sz="4" w:space="0" w:shadow="0" w:frame="0"/>
@@ -2895,11 +3271,50 @@
             </w:tcMar>
             <w:vAlign w:val="top"/>
           </w:tcPr>
+          <w:p>
+            <w:pPr>
+              <w:pStyle w:val="Table Style 2"/>
+              <w:jc w:val="center"/>
+            </w:pPr>
+            <w:r>
+              <w:rPr>
+                <w:rFonts w:ascii="Helvetica Neue" w:hAnsi="Helvetica Neue"/>
+                <w:outline w:val="0"/>
+                <w:color w:val="295ff4"/>
+                <w:rtl w:val="0"/>
+                <w14:textFill>
+                  <w14:solidFill>
+                    <w14:srgbClr w14:val="295FF4"/>
+                  </w14:solidFill>
+                </w14:textFill>
+              </w:rPr>
+              <w:t>CH02 P82</w:t>
+            </w:r>
+          </w:p>
+        </w:tc>
+        <w:tc>
+          <w:tcPr>
+            <w:tcW w:type="dxa" w:w="1014"/>
+            <w:tcBorders>
+              <w:top w:val="single" w:color="929292" w:sz="4" w:space="0" w:shadow="0" w:frame="0"/>
+              <w:left w:val="single" w:color="929292" w:sz="4" w:space="0" w:shadow="0" w:frame="0"/>
+              <w:bottom w:val="single" w:color="929292" w:sz="4" w:space="0" w:shadow="0" w:frame="0"/>
+              <w:right w:val="single" w:color="929292" w:sz="4" w:space="0" w:shadow="0" w:frame="0"/>
+            </w:tcBorders>
+            <w:shd w:val="clear" w:color="auto" w:fill="f7f7f6"/>
+            <w:tcMar>
+              <w:top w:type="dxa" w:w="80"/>
+              <w:left w:type="dxa" w:w="80"/>
+              <w:bottom w:type="dxa" w:w="80"/>
+              <w:right w:type="dxa" w:w="80"/>
+            </w:tcMar>
+            <w:vAlign w:val="top"/>
+          </w:tcPr>
           <w:p/>
         </w:tc>
         <w:tc>
           <w:tcPr>
-            <w:tcW w:type="dxa" w:w="1402"/>
+            <w:tcW w:type="dxa" w:w="1235"/>
             <w:tcBorders>
               <w:top w:val="single" w:color="929292" w:sz="4" w:space="0" w:shadow="0" w:frame="0"/>
               <w:left w:val="single" w:color="929292" w:sz="4" w:space="0" w:shadow="0" w:frame="0"/>
@@ -2919,7 +3334,7 @@
         </w:tc>
         <w:tc>
           <w:tcPr>
-            <w:tcW w:type="dxa" w:w="1253"/>
+            <w:tcW w:type="dxa" w:w="1104"/>
             <w:tcBorders>
               <w:top w:val="single" w:color="929292" w:sz="4" w:space="0" w:shadow="0" w:frame="0"/>
               <w:left w:val="single" w:color="929292" w:sz="4" w:space="0" w:shadow="0" w:frame="0"/>
@@ -2997,7 +3412,7 @@
         </w:trPr>
         <w:tc>
           <w:tcPr>
-            <w:tcW w:type="dxa" w:w="951"/>
+            <w:tcW w:type="dxa" w:w="838"/>
             <w:tcBorders>
               <w:top w:val="single" w:color="929292" w:sz="4" w:space="0" w:shadow="0" w:frame="0"/>
               <w:left w:val="single" w:color="929292" w:sz="4" w:space="0" w:shadow="0" w:frame="0"/>
@@ -3029,7 +3444,7 @@
         </w:tc>
         <w:tc>
           <w:tcPr>
-            <w:tcW w:type="dxa" w:w="4525"/>
+            <w:tcW w:type="dxa" w:w="3986"/>
             <w:tcBorders>
               <w:top w:val="single" w:color="929292" w:sz="4" w:space="0" w:shadow="0" w:frame="0"/>
               <w:left w:val="single" w:color="89847f" w:sz="8" w:space="0" w:shadow="0" w:frame="0"/>
@@ -3075,7 +3490,7 @@
         </w:tc>
         <w:tc>
           <w:tcPr>
-            <w:tcW w:type="dxa" w:w="1151"/>
+            <w:tcW w:type="dxa" w:w="1104"/>
             <w:tcBorders>
               <w:top w:val="single" w:color="929292" w:sz="4" w:space="0" w:shadow="0" w:frame="0"/>
               <w:left w:val="single" w:color="929292" w:sz="4" w:space="0" w:shadow="0" w:frame="0"/>
@@ -3091,11 +3506,50 @@
             </w:tcMar>
             <w:vAlign w:val="top"/>
           </w:tcPr>
+          <w:p>
+            <w:pPr>
+              <w:pStyle w:val="Table Style 2"/>
+              <w:jc w:val="center"/>
+            </w:pPr>
+            <w:r>
+              <w:rPr>
+                <w:rFonts w:ascii="Helvetica Neue" w:hAnsi="Helvetica Neue"/>
+                <w:outline w:val="0"/>
+                <w:color w:val="295ff4"/>
+                <w:rtl w:val="0"/>
+                <w14:textFill>
+                  <w14:solidFill>
+                    <w14:srgbClr w14:val="295FF4"/>
+                  </w14:solidFill>
+                </w14:textFill>
+              </w:rPr>
+              <w:t>CH03 P6</w:t>
+            </w:r>
+          </w:p>
+        </w:tc>
+        <w:tc>
+          <w:tcPr>
+            <w:tcW w:type="dxa" w:w="1014"/>
+            <w:tcBorders>
+              <w:top w:val="single" w:color="929292" w:sz="4" w:space="0" w:shadow="0" w:frame="0"/>
+              <w:left w:val="single" w:color="929292" w:sz="4" w:space="0" w:shadow="0" w:frame="0"/>
+              <w:bottom w:val="single" w:color="929292" w:sz="4" w:space="0" w:shadow="0" w:frame="0"/>
+              <w:right w:val="single" w:color="929292" w:sz="4" w:space="0" w:shadow="0" w:frame="0"/>
+            </w:tcBorders>
+            <w:shd w:val="clear" w:color="auto" w:fill="auto"/>
+            <w:tcMar>
+              <w:top w:type="dxa" w:w="80"/>
+              <w:left w:type="dxa" w:w="80"/>
+              <w:bottom w:type="dxa" w:w="80"/>
+              <w:right w:type="dxa" w:w="80"/>
+            </w:tcMar>
+            <w:vAlign w:val="top"/>
+          </w:tcPr>
           <w:p/>
         </w:tc>
         <w:tc>
           <w:tcPr>
-            <w:tcW w:type="dxa" w:w="1402"/>
+            <w:tcW w:type="dxa" w:w="1235"/>
             <w:tcBorders>
               <w:top w:val="single" w:color="929292" w:sz="4" w:space="0" w:shadow="0" w:frame="0"/>
               <w:left w:val="single" w:color="929292" w:sz="4" w:space="0" w:shadow="0" w:frame="0"/>
@@ -3127,14 +3581,14 @@
         </w:tc>
         <w:tc>
           <w:tcPr>
-            <w:tcW w:type="dxa" w:w="1253"/>
-            <w:tcBorders>
-              <w:top w:val="single" w:color="929292" w:sz="4" w:space="0" w:shadow="0" w:frame="0"/>
-              <w:left w:val="single" w:color="929292" w:sz="4" w:space="0" w:shadow="0" w:frame="0"/>
-              <w:bottom w:val="single" w:color="929292" w:sz="4" w:space="0" w:shadow="0" w:frame="0"/>
-              <w:right w:val="single" w:color="929292" w:sz="4" w:space="0" w:shadow="0" w:frame="0"/>
-            </w:tcBorders>
-            <w:shd w:val="clear" w:color="auto" w:fill="295ff4"/>
+            <w:tcW w:type="dxa" w:w="1104"/>
+            <w:tcBorders>
+              <w:top w:val="single" w:color="929292" w:sz="4" w:space="0" w:shadow="0" w:frame="0"/>
+              <w:left w:val="single" w:color="929292" w:sz="4" w:space="0" w:shadow="0" w:frame="0"/>
+              <w:bottom w:val="single" w:color="929292" w:sz="4" w:space="0" w:shadow="0" w:frame="0"/>
+              <w:right w:val="single" w:color="929292" w:sz="4" w:space="0" w:shadow="0" w:frame="0"/>
+            </w:tcBorders>
+            <w:shd w:val="clear" w:color="auto" w:fill="782cf6"/>
             <w:tcMar>
               <w:top w:type="dxa" w:w="80"/>
               <w:left w:type="dxa" w:w="80"/>
@@ -3191,7 +3645,7 @@
                   </w14:solidFill>
                 </w14:textFill>
               </w:rPr>
-              <w:t>Open</w:t>
+              <w:t>In progress</w:t>
             </w:r>
           </w:p>
         </w:tc>
@@ -3205,7 +3659,7 @@
         </w:trPr>
         <w:tc>
           <w:tcPr>
-            <w:tcW w:type="dxa" w:w="951"/>
+            <w:tcW w:type="dxa" w:w="838"/>
             <w:tcBorders>
               <w:top w:val="single" w:color="929292" w:sz="4" w:space="0" w:shadow="0" w:frame="0"/>
               <w:left w:val="single" w:color="929292" w:sz="4" w:space="0" w:shadow="0" w:frame="0"/>
@@ -3237,7 +3691,7 @@
         </w:tc>
         <w:tc>
           <w:tcPr>
-            <w:tcW w:type="dxa" w:w="4525"/>
+            <w:tcW w:type="dxa" w:w="3986"/>
             <w:tcBorders>
               <w:top w:val="single" w:color="929292" w:sz="4" w:space="0" w:shadow="0" w:frame="0"/>
               <w:left w:val="single" w:color="89847f" w:sz="8" w:space="0" w:shadow="0" w:frame="0"/>
@@ -3269,7 +3723,7 @@
         </w:tc>
         <w:tc>
           <w:tcPr>
-            <w:tcW w:type="dxa" w:w="1151"/>
+            <w:tcW w:type="dxa" w:w="1104"/>
             <w:tcBorders>
               <w:top w:val="single" w:color="929292" w:sz="4" w:space="0" w:shadow="0" w:frame="0"/>
               <w:left w:val="single" w:color="929292" w:sz="4" w:space="0" w:shadow="0" w:frame="0"/>
@@ -3285,11 +3739,50 @@
             </w:tcMar>
             <w:vAlign w:val="top"/>
           </w:tcPr>
+          <w:p>
+            <w:pPr>
+              <w:pStyle w:val="Table Style 2"/>
+              <w:jc w:val="center"/>
+            </w:pPr>
+            <w:r>
+              <w:rPr>
+                <w:rFonts w:ascii="Helvetica Neue" w:hAnsi="Helvetica Neue"/>
+                <w:outline w:val="0"/>
+                <w:color w:val="295ff4"/>
+                <w:rtl w:val="0"/>
+                <w14:textFill>
+                  <w14:solidFill>
+                    <w14:srgbClr w14:val="295FF4"/>
+                  </w14:solidFill>
+                </w14:textFill>
+              </w:rPr>
+              <w:t>CH02 P26</w:t>
+            </w:r>
+          </w:p>
+        </w:tc>
+        <w:tc>
+          <w:tcPr>
+            <w:tcW w:type="dxa" w:w="1014"/>
+            <w:tcBorders>
+              <w:top w:val="single" w:color="929292" w:sz="4" w:space="0" w:shadow="0" w:frame="0"/>
+              <w:left w:val="single" w:color="929292" w:sz="4" w:space="0" w:shadow="0" w:frame="0"/>
+              <w:bottom w:val="single" w:color="929292" w:sz="4" w:space="0" w:shadow="0" w:frame="0"/>
+              <w:right w:val="single" w:color="929292" w:sz="4" w:space="0" w:shadow="0" w:frame="0"/>
+            </w:tcBorders>
+            <w:shd w:val="clear" w:color="auto" w:fill="f7f7f6"/>
+            <w:tcMar>
+              <w:top w:type="dxa" w:w="80"/>
+              <w:left w:type="dxa" w:w="80"/>
+              <w:bottom w:type="dxa" w:w="80"/>
+              <w:right w:type="dxa" w:w="80"/>
+            </w:tcMar>
+            <w:vAlign w:val="top"/>
+          </w:tcPr>
           <w:p/>
         </w:tc>
         <w:tc>
           <w:tcPr>
-            <w:tcW w:type="dxa" w:w="1402"/>
+            <w:tcW w:type="dxa" w:w="1235"/>
             <w:tcBorders>
               <w:top w:val="single" w:color="929292" w:sz="4" w:space="0" w:shadow="0" w:frame="0"/>
               <w:left w:val="single" w:color="929292" w:sz="4" w:space="0" w:shadow="0" w:frame="0"/>
@@ -3309,7 +3802,7 @@
         </w:tc>
         <w:tc>
           <w:tcPr>
-            <w:tcW w:type="dxa" w:w="1253"/>
+            <w:tcW w:type="dxa" w:w="1104"/>
             <w:tcBorders>
               <w:top w:val="single" w:color="929292" w:sz="4" w:space="0" w:shadow="0" w:frame="0"/>
               <w:left w:val="single" w:color="929292" w:sz="4" w:space="0" w:shadow="0" w:frame="0"/>
@@ -3387,7 +3880,7 @@
         </w:trPr>
         <w:tc>
           <w:tcPr>
-            <w:tcW w:type="dxa" w:w="951"/>
+            <w:tcW w:type="dxa" w:w="838"/>
             <w:tcBorders>
               <w:top w:val="single" w:color="929292" w:sz="4" w:space="0" w:shadow="0" w:frame="0"/>
               <w:left w:val="single" w:color="929292" w:sz="4" w:space="0" w:shadow="0" w:frame="0"/>
@@ -3419,7 +3912,7 @@
         </w:tc>
         <w:tc>
           <w:tcPr>
-            <w:tcW w:type="dxa" w:w="4525"/>
+            <w:tcW w:type="dxa" w:w="3986"/>
             <w:tcBorders>
               <w:top w:val="single" w:color="929292" w:sz="4" w:space="0" w:shadow="0" w:frame="0"/>
               <w:left w:val="single" w:color="89847f" w:sz="8" w:space="0" w:shadow="0" w:frame="0"/>
@@ -3451,7 +3944,7 @@
         </w:tc>
         <w:tc>
           <w:tcPr>
-            <w:tcW w:type="dxa" w:w="1151"/>
+            <w:tcW w:type="dxa" w:w="1104"/>
             <w:tcBorders>
               <w:top w:val="single" w:color="929292" w:sz="4" w:space="0" w:shadow="0" w:frame="0"/>
               <w:left w:val="single" w:color="929292" w:sz="4" w:space="0" w:shadow="0" w:frame="0"/>
@@ -3467,11 +3960,50 @@
             </w:tcMar>
             <w:vAlign w:val="top"/>
           </w:tcPr>
+          <w:p>
+            <w:pPr>
+              <w:pStyle w:val="Table Style 2"/>
+              <w:jc w:val="center"/>
+            </w:pPr>
+            <w:r>
+              <w:rPr>
+                <w:rFonts w:ascii="Helvetica Neue" w:hAnsi="Helvetica Neue"/>
+                <w:outline w:val="0"/>
+                <w:color w:val="295ff4"/>
+                <w:rtl w:val="0"/>
+                <w14:textFill>
+                  <w14:solidFill>
+                    <w14:srgbClr w14:val="295FF4"/>
+                  </w14:solidFill>
+                </w14:textFill>
+              </w:rPr>
+              <w:t>CH02 P63</w:t>
+            </w:r>
+          </w:p>
+        </w:tc>
+        <w:tc>
+          <w:tcPr>
+            <w:tcW w:type="dxa" w:w="1014"/>
+            <w:tcBorders>
+              <w:top w:val="single" w:color="929292" w:sz="4" w:space="0" w:shadow="0" w:frame="0"/>
+              <w:left w:val="single" w:color="929292" w:sz="4" w:space="0" w:shadow="0" w:frame="0"/>
+              <w:bottom w:val="single" w:color="929292" w:sz="4" w:space="0" w:shadow="0" w:frame="0"/>
+              <w:right w:val="single" w:color="929292" w:sz="4" w:space="0" w:shadow="0" w:frame="0"/>
+            </w:tcBorders>
+            <w:shd w:val="clear" w:color="auto" w:fill="auto"/>
+            <w:tcMar>
+              <w:top w:type="dxa" w:w="80"/>
+              <w:left w:type="dxa" w:w="80"/>
+              <w:bottom w:type="dxa" w:w="80"/>
+              <w:right w:type="dxa" w:w="80"/>
+            </w:tcMar>
+            <w:vAlign w:val="top"/>
+          </w:tcPr>
           <w:p/>
         </w:tc>
         <w:tc>
           <w:tcPr>
-            <w:tcW w:type="dxa" w:w="1402"/>
+            <w:tcW w:type="dxa" w:w="1235"/>
             <w:tcBorders>
               <w:top w:val="single" w:color="929292" w:sz="4" w:space="0" w:shadow="0" w:frame="0"/>
               <w:left w:val="single" w:color="929292" w:sz="4" w:space="0" w:shadow="0" w:frame="0"/>
@@ -3491,7 +4023,7 @@
         </w:tc>
         <w:tc>
           <w:tcPr>
-            <w:tcW w:type="dxa" w:w="1253"/>
+            <w:tcW w:type="dxa" w:w="1104"/>
             <w:tcBorders>
               <w:top w:val="single" w:color="929292" w:sz="4" w:space="0" w:shadow="0" w:frame="0"/>
               <w:left w:val="single" w:color="929292" w:sz="4" w:space="0" w:shadow="0" w:frame="0"/>
@@ -3560,6 +4092,239 @@
           </w:p>
         </w:tc>
       </w:tr>
+      <w:tr>
+        <w:tblPrEx>
+          <w:shd w:val="clear" w:color="auto" w:fill="auto"/>
+        </w:tblPrEx>
+        <w:trPr>
+          <w:trHeight w:val="295" w:hRule="atLeast"/>
+        </w:trPr>
+        <w:tc>
+          <w:tcPr>
+            <w:tcW w:type="dxa" w:w="838"/>
+            <w:tcBorders>
+              <w:top w:val="single" w:color="929292" w:sz="4" w:space="0" w:shadow="0" w:frame="0"/>
+              <w:left w:val="single" w:color="929292" w:sz="4" w:space="0" w:shadow="0" w:frame="0"/>
+              <w:bottom w:val="single" w:color="929292" w:sz="4" w:space="0" w:shadow="0" w:frame="0"/>
+              <w:right w:val="single" w:color="89847f" w:sz="8" w:space="0" w:shadow="0" w:frame="0"/>
+            </w:tcBorders>
+            <w:shd w:val="clear" w:color="auto" w:fill="auto"/>
+            <w:tcMar>
+              <w:top w:type="dxa" w:w="80"/>
+              <w:left w:type="dxa" w:w="80"/>
+              <w:bottom w:type="dxa" w:w="80"/>
+              <w:right w:type="dxa" w:w="80"/>
+            </w:tcMar>
+            <w:vAlign w:val="center"/>
+          </w:tcPr>
+          <w:p>
+            <w:pPr>
+              <w:pStyle w:val="Table Style 4"/>
+              <w:jc w:val="center"/>
+            </w:pPr>
+            <w:r>
+              <w:rPr>
+                <w:rFonts w:ascii="Helvetica Neue Medium" w:hAnsi="Helvetica Neue Medium"/>
+                <w:rtl w:val="0"/>
+              </w:rPr>
+              <w:t>15</w:t>
+            </w:r>
+          </w:p>
+        </w:tc>
+        <w:tc>
+          <w:tcPr>
+            <w:tcW w:type="dxa" w:w="3986"/>
+            <w:tcBorders>
+              <w:top w:val="single" w:color="929292" w:sz="4" w:space="0" w:shadow="0" w:frame="0"/>
+              <w:left w:val="single" w:color="89847f" w:sz="8" w:space="0" w:shadow="0" w:frame="0"/>
+              <w:bottom w:val="single" w:color="929292" w:sz="4" w:space="0" w:shadow="0" w:frame="0"/>
+              <w:right w:val="single" w:color="929292" w:sz="4" w:space="0" w:shadow="0" w:frame="0"/>
+            </w:tcBorders>
+            <w:shd w:val="clear" w:color="auto" w:fill="f7f7f6"/>
+            <w:tcMar>
+              <w:top w:type="dxa" w:w="80"/>
+              <w:left w:type="dxa" w:w="80"/>
+              <w:bottom w:type="dxa" w:w="80"/>
+              <w:right w:type="dxa" w:w="80"/>
+            </w:tcMar>
+            <w:vAlign w:val="top"/>
+          </w:tcPr>
+          <w:p>
+            <w:pPr>
+              <w:pStyle w:val="Table Style 2"/>
+              <w:bidi w:val="0"/>
+            </w:pPr>
+            <w:r>
+              <w:rPr>
+                <w:rFonts w:ascii="Helvetica Neue" w:cs="Arial Unicode MS" w:hAnsi="Helvetica Neue" w:eastAsia="Arial Unicode MS"/>
+                <w:rtl w:val="0"/>
+              </w:rPr>
+              <w:t>Make System request docs</w:t>
+            </w:r>
+          </w:p>
+        </w:tc>
+        <w:tc>
+          <w:tcPr>
+            <w:tcW w:type="dxa" w:w="1104"/>
+            <w:tcBorders>
+              <w:top w:val="single" w:color="929292" w:sz="4" w:space="0" w:shadow="0" w:frame="0"/>
+              <w:left w:val="single" w:color="929292" w:sz="4" w:space="0" w:shadow="0" w:frame="0"/>
+              <w:bottom w:val="single" w:color="929292" w:sz="4" w:space="0" w:shadow="0" w:frame="0"/>
+              <w:right w:val="single" w:color="929292" w:sz="4" w:space="0" w:shadow="0" w:frame="0"/>
+            </w:tcBorders>
+            <w:shd w:val="clear" w:color="auto" w:fill="f7f7f6"/>
+            <w:tcMar>
+              <w:top w:type="dxa" w:w="80"/>
+              <w:left w:type="dxa" w:w="80"/>
+              <w:bottom w:type="dxa" w:w="80"/>
+              <w:right w:type="dxa" w:w="80"/>
+            </w:tcMar>
+            <w:vAlign w:val="top"/>
+          </w:tcPr>
+          <w:p>
+            <w:pPr>
+              <w:pStyle w:val="Table Style 2"/>
+              <w:jc w:val="center"/>
+            </w:pPr>
+            <w:r>
+              <w:rPr>
+                <w:rFonts w:ascii="Helvetica Neue" w:hAnsi="Helvetica Neue"/>
+                <w:outline w:val="0"/>
+                <w:color w:val="295ff4"/>
+                <w:rtl w:val="0"/>
+                <w14:textFill>
+                  <w14:solidFill>
+                    <w14:srgbClr w14:val="295FF4"/>
+                  </w14:solidFill>
+                </w14:textFill>
+              </w:rPr>
+              <w:t>CH02 P6</w:t>
+            </w:r>
+          </w:p>
+        </w:tc>
+        <w:tc>
+          <w:tcPr>
+            <w:tcW w:type="dxa" w:w="1014"/>
+            <w:tcBorders>
+              <w:top w:val="single" w:color="929292" w:sz="4" w:space="0" w:shadow="0" w:frame="0"/>
+              <w:left w:val="single" w:color="929292" w:sz="4" w:space="0" w:shadow="0" w:frame="0"/>
+              <w:bottom w:val="single" w:color="929292" w:sz="4" w:space="0" w:shadow="0" w:frame="0"/>
+              <w:right w:val="single" w:color="929292" w:sz="4" w:space="0" w:shadow="0" w:frame="0"/>
+            </w:tcBorders>
+            <w:shd w:val="clear" w:color="auto" w:fill="f7f7f6"/>
+            <w:tcMar>
+              <w:top w:type="dxa" w:w="80"/>
+              <w:left w:type="dxa" w:w="80"/>
+              <w:bottom w:type="dxa" w:w="80"/>
+              <w:right w:type="dxa" w:w="80"/>
+            </w:tcMar>
+            <w:vAlign w:val="top"/>
+          </w:tcPr>
+          <w:p/>
+        </w:tc>
+        <w:tc>
+          <w:tcPr>
+            <w:tcW w:type="dxa" w:w="1235"/>
+            <w:tcBorders>
+              <w:top w:val="single" w:color="929292" w:sz="4" w:space="0" w:shadow="0" w:frame="0"/>
+              <w:left w:val="single" w:color="929292" w:sz="4" w:space="0" w:shadow="0" w:frame="0"/>
+              <w:bottom w:val="single" w:color="929292" w:sz="4" w:space="0" w:shadow="0" w:frame="0"/>
+              <w:right w:val="single" w:color="929292" w:sz="4" w:space="0" w:shadow="0" w:frame="0"/>
+            </w:tcBorders>
+            <w:shd w:val="clear" w:color="auto" w:fill="f7f7f6"/>
+            <w:tcMar>
+              <w:top w:type="dxa" w:w="80"/>
+              <w:left w:type="dxa" w:w="80"/>
+              <w:bottom w:type="dxa" w:w="80"/>
+              <w:right w:type="dxa" w:w="80"/>
+            </w:tcMar>
+            <w:vAlign w:val="top"/>
+          </w:tcPr>
+          <w:p>
+            <w:pPr>
+              <w:pStyle w:val="Table Style 2"/>
+              <w:jc w:val="center"/>
+            </w:pPr>
+            <w:r>
+              <w:rPr>
+                <w:rFonts w:ascii="Helvetica Neue" w:hAnsi="Helvetica Neue"/>
+                <w:rtl w:val="0"/>
+              </w:rPr>
+              <w:t>3</w:t>
+            </w:r>
+          </w:p>
+        </w:tc>
+        <w:tc>
+          <w:tcPr>
+            <w:tcW w:type="dxa" w:w="1104"/>
+            <w:tcBorders>
+              <w:top w:val="single" w:color="929292" w:sz="4" w:space="0" w:shadow="0" w:frame="0"/>
+              <w:left w:val="single" w:color="929292" w:sz="4" w:space="0" w:shadow="0" w:frame="0"/>
+              <w:bottom w:val="single" w:color="929292" w:sz="4" w:space="0" w:shadow="0" w:frame="0"/>
+              <w:right w:val="single" w:color="929292" w:sz="4" w:space="0" w:shadow="0" w:frame="0"/>
+            </w:tcBorders>
+            <w:shd w:val="clear" w:color="auto" w:fill="f7f7f6"/>
+            <w:tcMar>
+              <w:top w:type="dxa" w:w="80"/>
+              <w:left w:type="dxa" w:w="80"/>
+              <w:bottom w:type="dxa" w:w="80"/>
+              <w:right w:type="dxa" w:w="80"/>
+            </w:tcMar>
+            <w:vAlign w:val="top"/>
+          </w:tcPr>
+          <w:p>
+            <w:pPr>
+              <w:keepNext w:val="0"/>
+              <w:keepLines w:val="0"/>
+              <w:pageBreakBefore w:val="0"/>
+              <w:widowControl w:val="1"/>
+              <w:shd w:val="clear" w:color="auto" w:fill="auto"/>
+              <w:suppressAutoHyphens w:val="0"/>
+              <w:bidi w:val="0"/>
+              <w:spacing w:before="0" w:after="0" w:line="240" w:lineRule="auto"/>
+              <w:ind w:left="0" w:right="0" w:firstLine="0"/>
+              <w:jc w:val="center"/>
+              <w:outlineLvl w:val="9"/>
+              <w:rPr>
+                <w:rtl w:val="0"/>
+              </w:rPr>
+            </w:pPr>
+            <w:r>
+              <w:rPr>
+                <w:rFonts w:ascii="Helvetica Neue" w:cs="Arial Unicode MS" w:hAnsi="Helvetica Neue" w:eastAsia="Arial Unicode MS"/>
+                <w:b w:val="0"/>
+                <w:bCs w:val="0"/>
+                <w:i w:val="0"/>
+                <w:iCs w:val="0"/>
+                <w:caps w:val="0"/>
+                <w:smallCaps w:val="0"/>
+                <w:strike w:val="0"/>
+                <w:dstrike w:val="0"/>
+                <w:outline w:val="0"/>
+                <w:color w:val="fefffe"/>
+                <w:spacing w:val="0"/>
+                <w:kern w:val="0"/>
+                <w:position w:val="0"/>
+                <w:sz w:val="20"/>
+                <w:szCs w:val="20"/>
+                <w:u w:val="none" w:color="fefffe"/>
+                <w:shd w:val="nil" w:color="auto" w:fill="auto"/>
+                <w:vertAlign w:val="baseline"/>
+                <w:rtl w:val="0"/>
+                <w14:textOutline>
+                  <w14:noFill/>
+                </w14:textOutline>
+                <w14:textFill>
+                  <w14:solidFill>
+                    <w14:srgbClr w14:val="FFFFFF"/>
+                  </w14:solidFill>
+                </w14:textFill>
+              </w:rPr>
+              <w:t>Open</w:t>
+            </w:r>
+          </w:p>
+        </w:tc>
+      </w:tr>
     </w:tbl>
     <w:p>
       <w:pPr>
@@ -3571,7 +4336,94 @@
           <w:right w:val="nil"/>
         </w:pBdr>
       </w:pPr>
-      <w:r/>
+    </w:p>
+    <w:p>
+      <w:pPr>
+        <w:pStyle w:val="Subtitle"/>
+        <w:pBdr>
+          <w:top w:val="single" w:color="000000" w:sz="8" w:space="6" w:shadow="0" w:frame="0"/>
+          <w:left w:val="nil"/>
+          <w:bottom w:val="nil"/>
+          <w:right w:val="nil"/>
+        </w:pBdr>
+      </w:pPr>
+      <w:r>
+        <w:rPr>
+          <w:rFonts w:ascii="Arial Unicode MS" w:cs="Arial Unicode MS" w:hAnsi="Arial Unicode MS" w:eastAsia="Arial Unicode MS" w:hint="cs"/>
+          <w:b w:val="0"/>
+          <w:bCs w:val="0"/>
+          <w:i w:val="0"/>
+          <w:iCs w:val="0"/>
+          <w:rtl w:val="1"/>
+        </w:rPr>
+        <w:t>راهنما</w:t>
+      </w:r>
+      <w:r>
+        <w:rPr>
+          <w:rFonts w:ascii="Helvetica Neue" w:hAnsi="Helvetica Neue"/>
+          <w:rtl w:val="0"/>
+          <w:lang w:val="en-US"/>
+        </w:rPr>
+        <w:t>:</w:t>
+      </w:r>
+    </w:p>
+    <w:p>
+      <w:pPr>
+        <w:pStyle w:val="Body"/>
+        <w:bidi w:val="0"/>
+      </w:pPr>
+      <w:r>
+        <w:rPr>
+          <w:rtl w:val="0"/>
+        </w:rPr>
+        <w:t>1) Resource address</w:t>
+      </w:r>
+    </w:p>
+    <w:p>
+      <w:pPr>
+        <w:pStyle w:val="Body"/>
+        <w:numPr>
+          <w:ilvl w:val="0"/>
+          <w:numId w:val="2"/>
+        </w:numPr>
+        <w:bidi w:val="1"/>
+      </w:pPr>
+      <w:r>
+        <w:rPr>
+          <w:rtl w:val="0"/>
+        </w:rPr>
+        <w:t>CH01 P12 : Chapter 1 page 12 of Teacher</w:t>
+      </w:r>
+      <w:r>
+        <w:rPr>
+          <w:rtl w:val="0"/>
+        </w:rPr>
+        <w:t>’</w:t>
+      </w:r>
+      <w:r>
+        <w:rPr>
+          <w:rtl w:val="0"/>
+        </w:rPr>
+        <w:t>s PDFs.</w:t>
+      </w:r>
+    </w:p>
+    <w:p>
+      <w:pPr>
+        <w:pStyle w:val="Body"/>
+        <w:bidi w:val="1"/>
+      </w:pPr>
+    </w:p>
+    <w:p>
+      <w:pPr>
+        <w:pStyle w:val="Body"/>
+        <w:bidi w:val="1"/>
+      </w:pPr>
+      <w:r>
+        <w:rPr>
+          <w:rtl w:val="0"/>
+        </w:rPr>
+        <w:t>2) NA: Not Available</w:t>
+      </w:r>
     </w:p>
     <w:sectPr>
       <w:headerReference w:type="default" r:id="rId4"/>
@@ -3632,6 +4484,277 @@
     </w:r>
   </w:p>
 </w:hdr>
+</file>
+
+<file path=word/numbering.xml><?xml version="1.0" encoding="utf-8"?>
+<w:numbering xmlns:w="http://schemas.openxmlformats.org/wordprocessingml/2006/main" xmlns:wp="http://schemas.openxmlformats.org/drawingml/2006/wordprocessingDrawing" xmlns:w14="http://schemas.microsoft.com/office/word/2010/wordml" xmlns:r="http://schemas.openxmlformats.org/officeDocument/2006/relationships" xmlns:v="urn:schemas-microsoft-com:vml" xmlns:o="urn:schemas-microsoft-com:office:office">
+  <w:abstractNum w:abstractNumId="0">
+    <w:multiLevelType w:val="hybridMultilevel"/>
+    <w:numStyleLink w:val="Dash"/>
+  </w:abstractNum>
+  <w:abstractNum w:abstractNumId="1">
+    <w:multiLevelType w:val="hybridMultilevel"/>
+    <w:styleLink w:val="Dash"/>
+    <w:lvl w:ilvl="0">
+      <w:start w:val="1"/>
+      <w:numFmt w:val="bullet"/>
+      <w:suff w:val="tab"/>
+      <w:lvlText w:val="-"/>
+      <w:lvlJc w:val="left"/>
+      <w:pPr>
+        <w:ind w:left="240" w:hanging="240"/>
+      </w:pPr>
+      <w:rPr>
+        <w:rFonts w:hAnsi="Arial Unicode MS"/>
+        <w:caps w:val="0"/>
+        <w:smallCaps w:val="0"/>
+        <w:strike w:val="0"/>
+        <w:dstrike w:val="0"/>
+        <w:outline w:val="0"/>
+        <w:emboss w:val="0"/>
+        <w:imprint w:val="0"/>
+        <w:spacing w:val="0"/>
+        <w:w w:val="100"/>
+        <w:kern w:val="0"/>
+        <w:position w:val="4"/>
+        <w:sz w:val="26"/>
+        <w:szCs w:val="26"/>
+        <w:highlight w:val="none"/>
+        <w:vertAlign w:val="baseline"/>
+      </w:rPr>
+    </w:lvl>
+    <w:lvl w:ilvl="1">
+      <w:start w:val="1"/>
+      <w:numFmt w:val="bullet"/>
+      <w:suff w:val="tab"/>
+      <w:lvlText w:val="-"/>
+      <w:lvlJc w:val="left"/>
+      <w:pPr>
+        <w:ind w:left="480" w:hanging="240"/>
+      </w:pPr>
+      <w:rPr>
+        <w:rFonts w:hAnsi="Arial Unicode MS"/>
+        <w:caps w:val="0"/>
+        <w:smallCaps w:val="0"/>
+        <w:strike w:val="0"/>
+        <w:dstrike w:val="0"/>
+        <w:outline w:val="0"/>
+        <w:emboss w:val="0"/>
+        <w:imprint w:val="0"/>
+        <w:spacing w:val="0"/>
+        <w:w w:val="100"/>
+        <w:kern w:val="0"/>
+        <w:position w:val="4"/>
+        <w:sz w:val="26"/>
+        <w:szCs w:val="26"/>
+        <w:highlight w:val="none"/>
+        <w:vertAlign w:val="baseline"/>
+      </w:rPr>
+    </w:lvl>
+    <w:lvl w:ilvl="2">
+      <w:start w:val="1"/>
+      <w:numFmt w:val="bullet"/>
+      <w:suff w:val="tab"/>
+      <w:lvlText w:val="-"/>
+      <w:lvlJc w:val="left"/>
+      <w:pPr>
+        <w:ind w:left="720" w:hanging="240"/>
+      </w:pPr>
+      <w:rPr>
+        <w:rFonts w:hAnsi="Arial Unicode MS"/>
+        <w:caps w:val="0"/>
+        <w:smallCaps w:val="0"/>
+        <w:strike w:val="0"/>
+        <w:dstrike w:val="0"/>
+        <w:outline w:val="0"/>
+        <w:emboss w:val="0"/>
+        <w:imprint w:val="0"/>
+        <w:spacing w:val="0"/>
+        <w:w w:val="100"/>
+        <w:kern w:val="0"/>
+        <w:position w:val="4"/>
+        <w:sz w:val="26"/>
+        <w:szCs w:val="26"/>
+        <w:highlight w:val="none"/>
+        <w:vertAlign w:val="baseline"/>
+      </w:rPr>
+    </w:lvl>
+    <w:lvl w:ilvl="3">
+      <w:start w:val="1"/>
+      <w:numFmt w:val="bullet"/>
+      <w:suff w:val="tab"/>
+      <w:lvlText w:val="-"/>
+      <w:lvlJc w:val="left"/>
+      <w:pPr>
+        <w:ind w:left="960" w:hanging="240"/>
+      </w:pPr>
+      <w:rPr>
+        <w:rFonts w:hAnsi="Arial Unicode MS"/>
+        <w:caps w:val="0"/>
+        <w:smallCaps w:val="0"/>
+        <w:strike w:val="0"/>
+        <w:dstrike w:val="0"/>
+        <w:outline w:val="0"/>
+        <w:emboss w:val="0"/>
+        <w:imprint w:val="0"/>
+        <w:spacing w:val="0"/>
+        <w:w w:val="100"/>
+        <w:kern w:val="0"/>
+        <w:position w:val="4"/>
+        <w:sz w:val="26"/>
+        <w:szCs w:val="26"/>
+        <w:highlight w:val="none"/>
+        <w:vertAlign w:val="baseline"/>
+      </w:rPr>
+    </w:lvl>
+    <w:lvl w:ilvl="4">
+      <w:start w:val="1"/>
+      <w:numFmt w:val="bullet"/>
+      <w:suff w:val="tab"/>
+      <w:lvlText w:val="-"/>
+      <w:lvlJc w:val="left"/>
+      <w:pPr>
+        <w:ind w:left="1200" w:hanging="240"/>
+      </w:pPr>
+      <w:rPr>
+        <w:rFonts w:hAnsi="Arial Unicode MS"/>
+        <w:caps w:val="0"/>
+        <w:smallCaps w:val="0"/>
+        <w:strike w:val="0"/>
+        <w:dstrike w:val="0"/>
+        <w:outline w:val="0"/>
+        <w:emboss w:val="0"/>
+        <w:imprint w:val="0"/>
+        <w:spacing w:val="0"/>
+        <w:w w:val="100"/>
+        <w:kern w:val="0"/>
+        <w:position w:val="4"/>
+        <w:sz w:val="26"/>
+        <w:szCs w:val="26"/>
+        <w:highlight w:val="none"/>
+        <w:vertAlign w:val="baseline"/>
+      </w:rPr>
+    </w:lvl>
+    <w:lvl w:ilvl="5">
+      <w:start w:val="1"/>
+      <w:numFmt w:val="bullet"/>
+      <w:suff w:val="tab"/>
+      <w:lvlText w:val="-"/>
+      <w:lvlJc w:val="left"/>
+      <w:pPr>
+        <w:ind w:left="1440" w:hanging="240"/>
+      </w:pPr>
+      <w:rPr>
+        <w:rFonts w:hAnsi="Arial Unicode MS"/>
+        <w:caps w:val="0"/>
+        <w:smallCaps w:val="0"/>
+        <w:strike w:val="0"/>
+        <w:dstrike w:val="0"/>
+        <w:outline w:val="0"/>
+        <w:emboss w:val="0"/>
+        <w:imprint w:val="0"/>
+        <w:spacing w:val="0"/>
+        <w:w w:val="100"/>
+        <w:kern w:val="0"/>
+        <w:position w:val="4"/>
+        <w:sz w:val="26"/>
+        <w:szCs w:val="26"/>
+        <w:highlight w:val="none"/>
+        <w:vertAlign w:val="baseline"/>
+      </w:rPr>
+    </w:lvl>
+    <w:lvl w:ilvl="6">
+      <w:start w:val="1"/>
+      <w:numFmt w:val="bullet"/>
+      <w:suff w:val="tab"/>
+      <w:lvlText w:val="-"/>
+      <w:lvlJc w:val="left"/>
+      <w:pPr>
+        <w:ind w:left="1680" w:hanging="240"/>
+      </w:pPr>
+      <w:rPr>
+        <w:rFonts w:hAnsi="Arial Unicode MS"/>
+        <w:caps w:val="0"/>
+        <w:smallCaps w:val="0"/>
+        <w:strike w:val="0"/>
+        <w:dstrike w:val="0"/>
+        <w:outline w:val="0"/>
+        <w:emboss w:val="0"/>
+        <w:imprint w:val="0"/>
+        <w:spacing w:val="0"/>
+        <w:w w:val="100"/>
+        <w:kern w:val="0"/>
+        <w:position w:val="4"/>
+        <w:sz w:val="26"/>
+        <w:szCs w:val="26"/>
+        <w:highlight w:val="none"/>
+        <w:vertAlign w:val="baseline"/>
+      </w:rPr>
+    </w:lvl>
+    <w:lvl w:ilvl="7">
+      <w:start w:val="1"/>
+      <w:numFmt w:val="bullet"/>
+      <w:suff w:val="tab"/>
+      <w:lvlText w:val="-"/>
+      <w:lvlJc w:val="left"/>
+      <w:pPr>
+        <w:ind w:left="1920" w:hanging="240"/>
+      </w:pPr>
+      <w:rPr>
+        <w:rFonts w:hAnsi="Arial Unicode MS"/>
+        <w:caps w:val="0"/>
+        <w:smallCaps w:val="0"/>
+        <w:strike w:val="0"/>
+        <w:dstrike w:val="0"/>
+        <w:outline w:val="0"/>
+        <w:emboss w:val="0"/>
+        <w:imprint w:val="0"/>
+        <w:spacing w:val="0"/>
+        <w:w w:val="100"/>
+        <w:kern w:val="0"/>
+        <w:position w:val="4"/>
+        <w:sz w:val="26"/>
+        <w:szCs w:val="26"/>
+        <w:highlight w:val="none"/>
+        <w:vertAlign w:val="baseline"/>
+      </w:rPr>
+    </w:lvl>
+    <w:lvl w:ilvl="8">
+      <w:start w:val="1"/>
+      <w:numFmt w:val="bullet"/>
+      <w:suff w:val="tab"/>
+      <w:lvlText w:val="-"/>
+      <w:lvlJc w:val="left"/>
+      <w:pPr>
+        <w:ind w:left="2160" w:hanging="240"/>
+      </w:pPr>
+      <w:rPr>
+        <w:rFonts w:hAnsi="Arial Unicode MS"/>
+        <w:caps w:val="0"/>
+        <w:smallCaps w:val="0"/>
+        <w:strike w:val="0"/>
+        <w:dstrike w:val="0"/>
+        <w:outline w:val="0"/>
+        <w:emboss w:val="0"/>
+        <w:imprint w:val="0"/>
+        <w:spacing w:val="0"/>
+        <w:w w:val="100"/>
+        <w:kern w:val="0"/>
+        <w:position w:val="4"/>
+        <w:sz w:val="26"/>
+        <w:szCs w:val="26"/>
+        <w:highlight w:val="none"/>
+        <w:vertAlign w:val="baseline"/>
+      </w:rPr>
+    </w:lvl>
+  </w:abstractNum>
+  <w:num w:numId="1">
+    <w:abstractNumId w:val="1"/>
+  </w:num>
+  <w:num w:numId="2">
+    <w:abstractNumId w:val="0"/>
+  </w:num>
+</w:numbering>
 </file>
 
 <file path=word/styles.xml><?xml version="1.0" encoding="utf-8"?>
@@ -4022,6 +5145,60 @@
         </w14:solidFill>
       </w14:textFill>
     </w:rPr>
+  </w:style>
+  <w:style w:type="paragraph" w:styleId="Subtitle">
+    <w:name w:val="Subtitle"/>
+    <w:next w:val="Body"/>
+    <w:pPr>
+      <w:keepNext w:val="1"/>
+      <w:keepLines w:val="0"/>
+      <w:pageBreakBefore w:val="0"/>
+      <w:widowControl w:val="1"/>
+      <w:shd w:val="clear" w:color="auto" w:fill="auto"/>
+      <w:suppressAutoHyphens w:val="0"/>
+      <w:bidi w:val="0"/>
+      <w:spacing w:before="0" w:after="0" w:line="240" w:lineRule="auto"/>
+      <w:ind w:left="0" w:right="0" w:firstLine="0"/>
+      <w:jc w:val="left"/>
+      <w:outlineLvl w:val="9"/>
+    </w:pPr>
+    <w:rPr>
+      <w:rFonts w:ascii="Arial Unicode MS" w:cs="Helvetica Neue" w:hAnsi="Arial Unicode MS" w:eastAsia="Arial Unicode MS" w:hint="cs"/>
+      <w:b w:val="0"/>
+      <w:bCs w:val="0"/>
+      <w:i w:val="0"/>
+      <w:iCs w:val="0"/>
+      <w:caps w:val="0"/>
+      <w:smallCaps w:val="0"/>
+      <w:strike w:val="0"/>
+      <w:dstrike w:val="0"/>
+      <w:outline w:val="0"/>
+      <w:color w:val="000000"/>
+      <w:spacing w:val="0"/>
+      <w:kern w:val="0"/>
+      <w:position w:val="0"/>
+      <w:sz w:val="40"/>
+      <w:szCs w:val="40"/>
+      <w:u w:val="none"/>
+      <w:shd w:val="nil" w:color="auto" w:fill="auto"/>
+      <w:vertAlign w:val="baseline"/>
+      <w14:textOutline>
+        <w14:noFill/>
+      </w14:textOutline>
+      <w14:textFill>
+        <w14:solidFill>
+          <w14:srgbClr w14:val="000000"/>
+        </w14:solidFill>
+      </w14:textFill>
+    </w:rPr>
+  </w:style>
+  <w:style w:type="numbering" w:styleId="Dash">
+    <w:name w:val="Dash"/>
+    <w:pPr>
+      <w:numPr>
+        <w:numId w:val="1"/>
+      </w:numPr>
+    </w:pPr>
   </w:style>
 </w:styles>
 </file>

</xml_diff>